<commit_message>
Booklet v3: print-first, no-computer quiz conditions
Quiz is open-material but no computers are allowed, so every artifact
now has to work on paper.

- index.html + README: v3 content (quick page, legislation appendix
  for exact citation, full print stylesheet)
- booklet.docx (root + quiz folder): rebuilt from the v3 source; drops
  the stale "course site is open" line, adds the quick page and appendix
- booklet.pdf: re-rendered from index.html with all answers expanded
  (22pp, vector — replaces the 16pp edition-2 rasterized file)

Co-Authored-By: Claude Opus 5 <noreply@anthropic.com>
</commit_message>
<xml_diff>
--- a/booklet.docx
+++ b/booklet.docx
@@ -79,7 +79,43 @@
           <w:szCs w:val="22"/>
           <w:rtl/>
         </w:rPr>
-        <w:t xml:space="preserve">מהדורה 2 — מאומתת מול אתר הקורס (25.8)</w:t>
+        <w:t xml:space="preserve">מהדורה 3 — מעודכנת לתנאי הבוחן: ללא מחשבים (25.8)</w:t>
+      </w:r>
+    </w:p>
+    <w:p>
+      <w:pPr>
+        <w:shd w:fill="FFF6E0" w:val="clear"/>
+        <w:bidi/>
+        <w:spacing w:after="120" w:before="0" w:line="276"/>
+        <w:ind w:left="150" w:right="150"/>
+      </w:pPr>
+      <w:r>
+        <w:rPr>
+          <w:rFonts w:ascii="Arial" w:cs="Arial" w:eastAsia="Arial" w:hAnsi="Arial"/>
+          <w:b/>
+          <w:bCs/>
+          <w:i w:val="false"/>
+          <w:iCs w:val="false"/>
+          <w:color w:val="222222"/>
+          <w:sz w:val="22"/>
+          <w:szCs w:val="22"/>
+          <w:rtl/>
+        </w:rPr>
+        <w:t xml:space="preserve">⚠ המרצה הודיעה: אין מחשבים בבוחן. </w:t>
+      </w:r>
+      <w:r>
+        <w:rPr>
+          <w:rFonts w:ascii="Arial" w:cs="Arial" w:eastAsia="Arial" w:hAnsi="Arial"/>
+          <w:b w:val="false"/>
+          <w:bCs w:val="false"/>
+          <w:i w:val="false"/>
+          <w:iCs w:val="false"/>
+          <w:color w:val="222222"/>
+          <w:sz w:val="22"/>
+          <w:szCs w:val="22"/>
+          <w:rtl/>
+        </w:rPr>
+        <w:t xml:space="preserve">אתר הקורס לא יהיה זמין — רק חומר מודפס. יש להדפיס: (1) חוברת זו; (2) את קובץ החקיקה של המרצה. סמנו בטוש את טבלת הסעיפים ואת רשימת המלכודות — אלה הדפים שתחזרו אליהם בפועל.</w:t>
       </w:r>
     </w:p>
     <w:p>
@@ -163,21 +199,21 @@
           <w:szCs w:val="22"/>
           <w:rtl/>
         </w:rPr>
-        <w:t xml:space="preserve">חומר פתוח: </w:t>
-      </w:r>
-      <w:r>
-        <w:rPr>
-          <w:rFonts w:ascii="Arial" w:cs="Arial" w:eastAsia="Arial" w:hAnsi="Arial"/>
-          <w:b w:val="false"/>
-          <w:bCs w:val="false"/>
-          <w:i w:val="false"/>
-          <w:iCs w:val="false"/>
-          <w:color w:val="222222"/>
-          <w:sz w:val="22"/>
-          <w:szCs w:val="22"/>
-          <w:rtl/>
-        </w:rPr>
-        <w:t xml:space="preserve">חומר מודפס + אתר הקורס פתוח. מומלץ להדפיס חוברת זו ואת קובץ החקיקה.</w:t>
+        <w:t xml:space="preserve">חומר פתוח — אך ללא מחשבים: </w:t>
+      </w:r>
+      <w:r>
+        <w:rPr>
+          <w:rFonts w:ascii="Arial" w:cs="Arial" w:eastAsia="Arial" w:hAnsi="Arial"/>
+          <w:b w:val="false"/>
+          <w:bCs w:val="false"/>
+          <w:i w:val="false"/>
+          <w:iCs w:val="false"/>
+          <w:color w:val="222222"/>
+          <w:sz w:val="22"/>
+          <w:szCs w:val="22"/>
+          <w:rtl/>
+        </w:rPr>
+        <w:t xml:space="preserve">רק חומר מודפס שהבאתם איתכם.</w:t>
       </w:r>
     </w:p>
     <w:p>
@@ -506,7 +542,1521 @@
           <w:szCs w:val="22"/>
           <w:rtl/>
         </w:rPr>
+        <w:t xml:space="preserve">נספח חקיקה — לשון הסעיפים לציטוט מדויק</w:t>
+      </w:r>
+    </w:p>
+    <w:p>
+      <w:pPr>
+        <w:pStyle w:val="ListParagraph"/>
+        <w:numPr>
+          <w:ilvl w:val="0"/>
+          <w:numId w:val="2"/>
+        </w:numPr>
+        <w:bidi/>
+        <w:spacing w:after="60" w:line="276"/>
+      </w:pPr>
+      <w:r>
+        <w:rPr>
+          <w:rFonts w:ascii="Arial" w:cs="Arial" w:eastAsia="Arial" w:hAnsi="Arial"/>
+          <w:b w:val="false"/>
+          <w:bCs w:val="false"/>
+          <w:i w:val="false"/>
+          <w:iCs w:val="false"/>
+          <w:color w:val="222222"/>
+          <w:sz w:val="22"/>
+          <w:szCs w:val="22"/>
+          <w:rtl/>
+        </w:rPr>
         <w:t xml:space="preserve">נספח — חומר שטרם נלמד (הטעיה בהרחבה, טעות סופר, כפייה, עושק)</w:t>
+      </w:r>
+    </w:p>
+    <w:p>
+      <w:r>
+        <w:br w:type="page"/>
+      </w:r>
+    </w:p>
+    <w:p>
+      <w:pPr>
+        <w:pStyle w:val="Heading1"/>
+        <w:keepNext/>
+        <w:bidi/>
+        <w:spacing w:after="160" w:before="240" w:line="276"/>
+      </w:pPr>
+      <w:r>
+        <w:rPr>
+          <w:rFonts w:ascii="Arial" w:cs="Arial" w:eastAsia="Arial" w:hAnsi="Arial"/>
+          <w:b/>
+          <w:bCs/>
+          <w:i w:val="false"/>
+          <w:iCs w:val="false"/>
+          <w:color w:val="1F3864"/>
+          <w:sz w:val="32"/>
+          <w:szCs w:val="32"/>
+          <w:rtl/>
+        </w:rPr>
+        <w:t xml:space="preserve">הדף המהיר — אם תסתכל רק בדף אחד</w:t>
+      </w:r>
+    </w:p>
+    <w:p>
+      <w:pPr>
+        <w:pStyle w:val="Heading3"/>
+        <w:keepNext/>
+        <w:bidi/>
+        <w:spacing w:after="80" w:before="140" w:line="276"/>
+      </w:pPr>
+      <w:r>
+        <w:rPr>
+          <w:rFonts w:ascii="Arial" w:cs="Arial" w:eastAsia="Arial" w:hAnsi="Arial"/>
+          <w:b/>
+          <w:bCs/>
+          <w:i w:val="false"/>
+          <w:iCs w:val="false"/>
+          <w:color w:val="404040"/>
+          <w:sz w:val="23"/>
+          <w:szCs w:val="23"/>
+          <w:rtl/>
+        </w:rPr>
+        <w:t xml:space="preserve">1 · תבנית התשובה</w:t>
+      </w:r>
+    </w:p>
+    <w:p>
+      <w:pPr>
+        <w:shd w:fill="F2F2F2" w:val="clear"/>
+        <w:bidi/>
+        <w:spacing w:after="120" w:before="0" w:line="276"/>
+        <w:ind w:left="200" w:right="200"/>
+      </w:pPr>
+      <w:r>
+        <w:rPr>
+          <w:rFonts w:ascii="Arial" w:cs="Arial" w:eastAsia="Arial" w:hAnsi="Arial"/>
+          <w:b w:val="false"/>
+          <w:bCs w:val="false"/>
+          <w:i/>
+          <w:iCs/>
+          <w:color w:val="333333"/>
+          <w:sz w:val="22"/>
+          <w:szCs w:val="22"/>
+          <w:rtl/>
+        </w:rPr>
+        <w:t xml:space="preserve">[נכון / לא נכון]. לפי סעיף ___ לחוק החוזים (חלק כללי) / פס"ד ___, הכלל הוא ש-___. בענייננו ___, ולכן ___.</w:t>
+      </w:r>
+    </w:p>
+    <w:p>
+      <w:pPr>
+        <w:bidi/>
+        <w:spacing w:after="120" w:before="0" w:line="276"/>
+      </w:pPr>
+      <w:r>
+        <w:rPr>
+          <w:rFonts w:ascii="Arial" w:cs="Arial" w:eastAsia="Arial" w:hAnsi="Arial"/>
+          <w:b w:val="false"/>
+          <w:bCs w:val="false"/>
+          <w:i w:val="false"/>
+          <w:iCs w:val="false"/>
+          <w:color w:val="555555"/>
+          <w:sz w:val="22"/>
+          <w:szCs w:val="22"/>
+          <w:rtl/>
+        </w:rPr>
+        <w:t xml:space="preserve">פסיקה חד-משמעית ← כלל + מקור מדויק ← משפט יישום. 2–4 שורות מספיקות.</w:t>
+      </w:r>
+    </w:p>
+    <w:p>
+      <w:pPr>
+        <w:pStyle w:val="Heading3"/>
+        <w:keepNext/>
+        <w:bidi/>
+        <w:spacing w:after="80" w:before="140" w:line="276"/>
+      </w:pPr>
+      <w:r>
+        <w:rPr>
+          <w:rFonts w:ascii="Arial" w:cs="Arial" w:eastAsia="Arial" w:hAnsi="Arial"/>
+          <w:b/>
+          <w:bCs/>
+          <w:i w:val="false"/>
+          <w:iCs w:val="false"/>
+          <w:color w:val="404040"/>
+          <w:sz w:val="23"/>
+          <w:szCs w:val="23"/>
+          <w:rtl/>
+        </w:rPr>
+        <w:t xml:space="preserve">2 · שש ההבחנות שמכריעות היגדים</w:t>
+      </w:r>
+    </w:p>
+    <w:tbl>
+      <w:tblPr>
+        <w:bidiVisual/>
+        <w:tblW w:type="dxa" w:w="9020"/>
+        <w:tblBorders>
+          <w:top w:val="single" w:color="auto" w:sz="4"/>
+          <w:left w:val="single" w:color="auto" w:sz="4"/>
+          <w:bottom w:val="single" w:color="auto" w:sz="4"/>
+          <w:right w:val="single" w:color="auto" w:sz="4"/>
+          <w:insideH w:val="single" w:color="auto" w:sz="4"/>
+          <w:insideV w:val="single" w:color="auto" w:sz="4"/>
+        </w:tblBorders>
+      </w:tblPr>
+      <w:tblGrid>
+        <w:gridCol w:w="2345"/>
+        <w:gridCol w:w="3337"/>
+        <w:gridCol w:w="3337"/>
+      </w:tblGrid>
+      <w:tr>
+        <w:trPr>
+          <w:tblHeader/>
+        </w:trPr>
+        <w:tc>
+          <w:tcPr>
+            <w:tcW w:type="dxa" w:w="2345"/>
+            <w:shd w:fill="1F3864" w:val="clear"/>
+            <w:tcMar>
+              <w:top w:type="dxa" w:w="60"/>
+              <w:left w:type="dxa" w:w="100"/>
+              <w:bottom w:type="dxa" w:w="60"/>
+              <w:right w:type="dxa" w:w="100"/>
+            </w:tcMar>
+            <w:vAlign w:val="center"/>
+          </w:tcPr>
+          <w:p>
+            <w:pPr>
+              <w:bidi/>
+              <w:spacing w:after="0" w:before="0" w:line="276"/>
+            </w:pPr>
+            <w:r>
+              <w:rPr>
+                <w:rFonts w:ascii="Arial" w:cs="Arial" w:eastAsia="Arial" w:hAnsi="Arial"/>
+                <w:b/>
+                <w:bCs/>
+                <w:i w:val="false"/>
+                <w:iCs w:val="false"/>
+                <w:color w:val="FFFFFF"/>
+                <w:sz w:val="21"/>
+                <w:szCs w:val="21"/>
+                <w:rtl/>
+              </w:rPr>
+              <w:t xml:space="preserve">ההבחנה</w:t>
+            </w:r>
+          </w:p>
+        </w:tc>
+        <w:tc>
+          <w:tcPr>
+            <w:tcW w:type="dxa" w:w="3337"/>
+            <w:shd w:fill="1F3864" w:val="clear"/>
+            <w:tcMar>
+              <w:top w:type="dxa" w:w="60"/>
+              <w:left w:type="dxa" w:w="100"/>
+              <w:bottom w:type="dxa" w:w="60"/>
+              <w:right w:type="dxa" w:w="100"/>
+            </w:tcMar>
+            <w:vAlign w:val="center"/>
+          </w:tcPr>
+          <w:p>
+            <w:pPr>
+              <w:bidi/>
+              <w:spacing w:after="0" w:before="0" w:line="276"/>
+            </w:pPr>
+            <w:r>
+              <w:rPr>
+                <w:rFonts w:ascii="Arial" w:cs="Arial" w:eastAsia="Arial" w:hAnsi="Arial"/>
+                <w:b/>
+                <w:bCs/>
+                <w:i w:val="false"/>
+                <w:iCs w:val="false"/>
+                <w:color w:val="FFFFFF"/>
+                <w:sz w:val="21"/>
+                <w:szCs w:val="21"/>
+                <w:rtl/>
+              </w:rPr>
+              <w:t xml:space="preserve">הצד האחד</w:t>
+            </w:r>
+          </w:p>
+        </w:tc>
+        <w:tc>
+          <w:tcPr>
+            <w:tcW w:type="dxa" w:w="3337"/>
+            <w:shd w:fill="1F3864" w:val="clear"/>
+            <w:tcMar>
+              <w:top w:type="dxa" w:w="60"/>
+              <w:left w:type="dxa" w:w="100"/>
+              <w:bottom w:type="dxa" w:w="60"/>
+              <w:right w:type="dxa" w:w="100"/>
+            </w:tcMar>
+            <w:vAlign w:val="center"/>
+          </w:tcPr>
+          <w:p>
+            <w:pPr>
+              <w:bidi/>
+              <w:spacing w:after="0" w:before="0" w:line="276"/>
+            </w:pPr>
+            <w:r>
+              <w:rPr>
+                <w:rFonts w:ascii="Arial" w:cs="Arial" w:eastAsia="Arial" w:hAnsi="Arial"/>
+                <w:b/>
+                <w:bCs/>
+                <w:i w:val="false"/>
+                <w:iCs w:val="false"/>
+                <w:color w:val="FFFFFF"/>
+                <w:sz w:val="21"/>
+                <w:szCs w:val="21"/>
+                <w:rtl/>
+              </w:rPr>
+              <w:t xml:space="preserve">הצד השני</w:t>
+            </w:r>
+          </w:p>
+        </w:tc>
+      </w:tr>
+      <w:tr>
+        <w:tc>
+          <w:tcPr>
+            <w:tcW w:type="dxa" w:w="2345"/>
+            <w:tcMar>
+              <w:top w:type="dxa" w:w="50"/>
+              <w:left w:type="dxa" w:w="100"/>
+              <w:bottom w:type="dxa" w:w="50"/>
+              <w:right w:type="dxa" w:w="100"/>
+            </w:tcMar>
+          </w:tcPr>
+          <w:p>
+            <w:pPr>
+              <w:bidi/>
+              <w:spacing w:after="0" w:before="0" w:line="276"/>
+            </w:pPr>
+            <w:r>
+              <w:rPr>
+                <w:rFonts w:ascii="Arial" w:cs="Arial" w:eastAsia="Arial" w:hAnsi="Arial"/>
+                <w:b w:val="false"/>
+                <w:bCs w:val="false"/>
+                <w:i w:val="false"/>
+                <w:iCs w:val="false"/>
+                <w:color w:val="222222"/>
+                <w:sz w:val="20"/>
+                <w:szCs w:val="20"/>
+                <w:rtl/>
+              </w:rPr>
+              <w:t xml:space="preserve">בטל / ניתן לביטול</w:t>
+            </w:r>
+          </w:p>
+        </w:tc>
+        <w:tc>
+          <w:tcPr>
+            <w:tcW w:type="dxa" w:w="3337"/>
+            <w:tcMar>
+              <w:top w:type="dxa" w:w="50"/>
+              <w:left w:type="dxa" w:w="100"/>
+              <w:bottom w:type="dxa" w:w="50"/>
+              <w:right w:type="dxa" w:w="100"/>
+            </w:tcMar>
+          </w:tcPr>
+          <w:p>
+            <w:pPr>
+              <w:bidi/>
+              <w:spacing w:after="0" w:before="0" w:line="276"/>
+            </w:pPr>
+            <w:r>
+              <w:rPr>
+                <w:rFonts w:ascii="Arial" w:cs="Arial" w:eastAsia="Arial" w:hAnsi="Arial"/>
+                <w:b w:val="false"/>
+                <w:bCs w:val="false"/>
+                <w:i w:val="false"/>
+                <w:iCs w:val="false"/>
+                <w:color w:val="222222"/>
+                <w:sz w:val="20"/>
+                <w:szCs w:val="20"/>
+                <w:rtl/>
+              </w:rPr>
+              <w:t xml:space="preserve">חוזה פסול (ס' 30) — בטל מעצמו, בלי הודעה.</w:t>
+            </w:r>
+          </w:p>
+        </w:tc>
+        <w:tc>
+          <w:tcPr>
+            <w:tcW w:type="dxa" w:w="3337"/>
+            <w:tcMar>
+              <w:top w:type="dxa" w:w="50"/>
+              <w:left w:type="dxa" w:w="100"/>
+              <w:bottom w:type="dxa" w:w="50"/>
+              <w:right w:type="dxa" w:w="100"/>
+            </w:tcMar>
+          </w:tcPr>
+          <w:p>
+            <w:pPr>
+              <w:bidi/>
+              <w:spacing w:after="0" w:before="0" w:line="276"/>
+            </w:pPr>
+            <w:r>
+              <w:rPr>
+                <w:rFonts w:ascii="Arial" w:cs="Arial" w:eastAsia="Arial" w:hAnsi="Arial"/>
+                <w:b w:val="false"/>
+                <w:bCs w:val="false"/>
+                <w:i w:val="false"/>
+                <w:iCs w:val="false"/>
+                <w:color w:val="222222"/>
+                <w:sz w:val="20"/>
+                <w:szCs w:val="20"/>
+                <w:rtl/>
+              </w:rPr>
+              <w:t xml:space="preserve">פגם ברצון (14, 15, 17, 18) — תקף עד שהנפגע יבטל.</w:t>
+            </w:r>
+          </w:p>
+        </w:tc>
+      </w:tr>
+      <w:tr>
+        <w:tc>
+          <w:tcPr>
+            <w:tcW w:type="dxa" w:w="2345"/>
+            <w:shd w:fill="F2F6FC" w:val="clear"/>
+            <w:tcMar>
+              <w:top w:type="dxa" w:w="50"/>
+              <w:left w:type="dxa" w:w="100"/>
+              <w:bottom w:type="dxa" w:w="50"/>
+              <w:right w:type="dxa" w:w="100"/>
+            </w:tcMar>
+          </w:tcPr>
+          <w:p>
+            <w:pPr>
+              <w:bidi/>
+              <w:spacing w:after="0" w:before="0" w:line="276"/>
+            </w:pPr>
+            <w:r>
+              <w:rPr>
+                <w:rFonts w:ascii="Arial" w:cs="Arial" w:eastAsia="Arial" w:hAnsi="Arial"/>
+                <w:b w:val="false"/>
+                <w:bCs w:val="false"/>
+                <w:i w:val="false"/>
+                <w:iCs w:val="false"/>
+                <w:color w:val="222222"/>
+                <w:sz w:val="20"/>
+                <w:szCs w:val="20"/>
+                <w:rtl/>
+              </w:rPr>
+              <w:t xml:space="preserve">מתן / מסירה</w:t>
+            </w:r>
+          </w:p>
+        </w:tc>
+        <w:tc>
+          <w:tcPr>
+            <w:tcW w:type="dxa" w:w="3337"/>
+            <w:shd w:fill="F2F6FC" w:val="clear"/>
+            <w:tcMar>
+              <w:top w:type="dxa" w:w="50"/>
+              <w:left w:type="dxa" w:w="100"/>
+              <w:bottom w:type="dxa" w:w="50"/>
+              <w:right w:type="dxa" w:w="100"/>
+            </w:tcMar>
+          </w:tcPr>
+          <w:p>
+            <w:pPr>
+              <w:bidi/>
+              <w:spacing w:after="0" w:before="0" w:line="276"/>
+            </w:pPr>
+            <w:r>
+              <w:rPr>
+                <w:rFonts w:ascii="Arial" w:cs="Arial" w:eastAsia="Arial" w:hAnsi="Arial"/>
+                <w:b w:val="false"/>
+                <w:bCs w:val="false"/>
+                <w:i w:val="false"/>
+                <w:iCs w:val="false"/>
+                <w:color w:val="222222"/>
+                <w:sz w:val="20"/>
+                <w:szCs w:val="20"/>
+                <w:rtl/>
+              </w:rPr>
+              <w:t xml:space="preserve">מתן קיבול = משלוח ה"כן" — ס' 3(א), 4(2).</w:t>
+            </w:r>
+          </w:p>
+        </w:tc>
+        <w:tc>
+          <w:tcPr>
+            <w:tcW w:type="dxa" w:w="3337"/>
+            <w:shd w:fill="F2F6FC" w:val="clear"/>
+            <w:tcMar>
+              <w:top w:type="dxa" w:w="50"/>
+              <w:left w:type="dxa" w:w="100"/>
+              <w:bottom w:type="dxa" w:w="50"/>
+              <w:right w:type="dxa" w:w="100"/>
+            </w:tcMar>
+          </w:tcPr>
+          <w:p>
+            <w:pPr>
+              <w:bidi/>
+              <w:spacing w:after="0" w:before="0" w:line="276"/>
+            </w:pPr>
+            <w:r>
+              <w:rPr>
+                <w:rFonts w:ascii="Arial" w:cs="Arial" w:eastAsia="Arial" w:hAnsi="Arial"/>
+                <w:b w:val="false"/>
+                <w:bCs w:val="false"/>
+                <w:i w:val="false"/>
+                <w:iCs w:val="false"/>
+                <w:color w:val="222222"/>
+                <w:sz w:val="20"/>
+                <w:szCs w:val="20"/>
+                <w:rtl/>
+              </w:rPr>
+              <w:t xml:space="preserve">מסירה = הגעתו למציע — ס' 10.</w:t>
+            </w:r>
+          </w:p>
+        </w:tc>
+      </w:tr>
+      <w:tr>
+        <w:tc>
+          <w:tcPr>
+            <w:tcW w:type="dxa" w:w="2345"/>
+            <w:tcMar>
+              <w:top w:type="dxa" w:w="50"/>
+              <w:left w:type="dxa" w:w="100"/>
+              <w:bottom w:type="dxa" w:w="50"/>
+              <w:right w:type="dxa" w:w="100"/>
+            </w:tcMar>
+          </w:tcPr>
+          <w:p>
+            <w:pPr>
+              <w:bidi/>
+              <w:spacing w:after="0" w:before="0" w:line="276"/>
+            </w:pPr>
+            <w:r>
+              <w:rPr>
+                <w:rFonts w:ascii="Arial" w:cs="Arial" w:eastAsia="Arial" w:hAnsi="Arial"/>
+                <w:b w:val="false"/>
+                <w:bCs w:val="false"/>
+                <w:i w:val="false"/>
+                <w:iCs w:val="false"/>
+                <w:color w:val="222222"/>
+                <w:sz w:val="20"/>
+                <w:szCs w:val="20"/>
+                <w:rtl/>
+              </w:rPr>
+              <w:t xml:space="preserve">14(א) / 14(ב)</w:t>
+            </w:r>
+          </w:p>
+        </w:tc>
+        <w:tc>
+          <w:tcPr>
+            <w:tcW w:type="dxa" w:w="3337"/>
+            <w:tcMar>
+              <w:top w:type="dxa" w:w="50"/>
+              <w:left w:type="dxa" w:w="100"/>
+              <w:bottom w:type="dxa" w:w="50"/>
+              <w:right w:type="dxa" w:w="100"/>
+            </w:tcMar>
+          </w:tcPr>
+          <w:p>
+            <w:pPr>
+              <w:bidi/>
+              <w:spacing w:after="0" w:before="0" w:line="276"/>
+            </w:pPr>
+            <w:r>
+              <w:rPr>
+                <w:rFonts w:ascii="Arial" w:cs="Arial" w:eastAsia="Arial" w:hAnsi="Arial"/>
+                <w:b w:val="false"/>
+                <w:bCs w:val="false"/>
+                <w:i w:val="false"/>
+                <w:iCs w:val="false"/>
+                <w:color w:val="222222"/>
+                <w:sz w:val="20"/>
+                <w:szCs w:val="20"/>
+                <w:rtl/>
+              </w:rPr>
+              <w:t xml:space="preserve">הצד השני ידע או היה עליו לדעת ← ביטול עצמי.</w:t>
+            </w:r>
+          </w:p>
+        </w:tc>
+        <w:tc>
+          <w:tcPr>
+            <w:tcW w:type="dxa" w:w="3337"/>
+            <w:tcMar>
+              <w:top w:type="dxa" w:w="50"/>
+              <w:left w:type="dxa" w:w="100"/>
+              <w:bottom w:type="dxa" w:w="50"/>
+              <w:right w:type="dxa" w:w="100"/>
+            </w:tcMar>
+          </w:tcPr>
+          <w:p>
+            <w:pPr>
+              <w:bidi/>
+              <w:spacing w:after="0" w:before="0" w:line="276"/>
+            </w:pPr>
+            <w:r>
+              <w:rPr>
+                <w:rFonts w:ascii="Arial" w:cs="Arial" w:eastAsia="Arial" w:hAnsi="Arial"/>
+                <w:b w:val="false"/>
+                <w:bCs w:val="false"/>
+                <w:i w:val="false"/>
+                <w:iCs w:val="false"/>
+                <w:color w:val="222222"/>
+                <w:sz w:val="20"/>
+                <w:szCs w:val="20"/>
+                <w:rtl/>
+              </w:rPr>
+              <w:t xml:space="preserve">לא ידע ← רק ביהמ"ש, משיקולי צדק + חשיפה לפיצויים.</w:t>
+            </w:r>
+          </w:p>
+        </w:tc>
+      </w:tr>
+      <w:tr>
+        <w:tc>
+          <w:tcPr>
+            <w:tcW w:type="dxa" w:w="2345"/>
+            <w:shd w:fill="F2F6FC" w:val="clear"/>
+            <w:tcMar>
+              <w:top w:type="dxa" w:w="50"/>
+              <w:left w:type="dxa" w:w="100"/>
+              <w:bottom w:type="dxa" w:w="50"/>
+              <w:right w:type="dxa" w:w="100"/>
+            </w:tcMar>
+          </w:tcPr>
+          <w:p>
+            <w:pPr>
+              <w:bidi/>
+              <w:spacing w:after="0" w:before="0" w:line="276"/>
+            </w:pPr>
+            <w:r>
+              <w:rPr>
+                <w:rFonts w:ascii="Arial" w:cs="Arial" w:eastAsia="Arial" w:hAnsi="Arial"/>
+                <w:b w:val="false"/>
+                <w:bCs w:val="false"/>
+                <w:i w:val="false"/>
+                <w:iCs w:val="false"/>
+                <w:color w:val="222222"/>
+                <w:sz w:val="20"/>
+                <w:szCs w:val="20"/>
+                <w:rtl/>
+              </w:rPr>
+              <w:t xml:space="preserve">טעות / כדאיות</w:t>
+            </w:r>
+          </w:p>
+        </w:tc>
+        <w:tc>
+          <w:tcPr>
+            <w:tcW w:type="dxa" w:w="3337"/>
+            <w:shd w:fill="F2F6FC" w:val="clear"/>
+            <w:tcMar>
+              <w:top w:type="dxa" w:w="50"/>
+              <w:left w:type="dxa" w:w="100"/>
+              <w:bottom w:type="dxa" w:w="50"/>
+              <w:right w:type="dxa" w:w="100"/>
+            </w:tcMar>
+          </w:tcPr>
+          <w:p>
+            <w:pPr>
+              <w:bidi/>
+              <w:spacing w:after="0" w:before="0" w:line="276"/>
+            </w:pPr>
+            <w:r>
+              <w:rPr>
+                <w:rFonts w:ascii="Arial" w:cs="Arial" w:eastAsia="Arial" w:hAnsi="Arial"/>
+                <w:b w:val="false"/>
+                <w:bCs w:val="false"/>
+                <w:i w:val="false"/>
+                <w:iCs w:val="false"/>
+                <w:color w:val="222222"/>
+                <w:sz w:val="20"/>
+                <w:szCs w:val="20"/>
+                <w:rtl/>
+              </w:rPr>
+              <w:t xml:space="preserve">טעות = הווה או עבר (רבינוביץ) ← עילה.</w:t>
+            </w:r>
+          </w:p>
+        </w:tc>
+        <w:tc>
+          <w:tcPr>
+            <w:tcW w:type="dxa" w:w="3337"/>
+            <w:shd w:fill="F2F6FC" w:val="clear"/>
+            <w:tcMar>
+              <w:top w:type="dxa" w:w="50"/>
+              <w:left w:type="dxa" w:w="100"/>
+              <w:bottom w:type="dxa" w:w="50"/>
+              <w:right w:type="dxa" w:w="100"/>
+            </w:tcMar>
+          </w:tcPr>
+          <w:p>
+            <w:pPr>
+              <w:bidi/>
+              <w:spacing w:after="0" w:before="0" w:line="276"/>
+            </w:pPr>
+            <w:r>
+              <w:rPr>
+                <w:rFonts w:ascii="Arial" w:cs="Arial" w:eastAsia="Arial" w:hAnsi="Arial"/>
+                <w:b w:val="false"/>
+                <w:bCs w:val="false"/>
+                <w:i w:val="false"/>
+                <w:iCs w:val="false"/>
+                <w:color w:val="222222"/>
+                <w:sz w:val="20"/>
+                <w:szCs w:val="20"/>
+                <w:rtl/>
+              </w:rPr>
+              <w:t xml:space="preserve">ציפייה לעתיד / AS-IS / סיכון מודע ← 14(ד), אין ביטול.</w:t>
+            </w:r>
+          </w:p>
+        </w:tc>
+      </w:tr>
+      <w:tr>
+        <w:tc>
+          <w:tcPr>
+            <w:tcW w:type="dxa" w:w="2345"/>
+            <w:tcMar>
+              <w:top w:type="dxa" w:w="50"/>
+              <w:left w:type="dxa" w:w="100"/>
+              <w:bottom w:type="dxa" w:w="50"/>
+              <w:right w:type="dxa" w:w="100"/>
+            </w:tcMar>
+          </w:tcPr>
+          <w:p>
+            <w:pPr>
+              <w:bidi/>
+              <w:spacing w:after="0" w:before="0" w:line="276"/>
+            </w:pPr>
+            <w:r>
+              <w:rPr>
+                <w:rFonts w:ascii="Arial" w:cs="Arial" w:eastAsia="Arial" w:hAnsi="Arial"/>
+                <w:b w:val="false"/>
+                <w:bCs w:val="false"/>
+                <w:i w:val="false"/>
+                <w:iCs w:val="false"/>
+                <w:color w:val="222222"/>
+                <w:sz w:val="20"/>
+                <w:szCs w:val="20"/>
+                <w:rtl/>
+              </w:rPr>
+              <w:t xml:space="preserve">שתיקה</w:t>
+            </w:r>
+          </w:p>
+        </w:tc>
+        <w:tc>
+          <w:tcPr>
+            <w:tcW w:type="dxa" w:w="3337"/>
+            <w:tcMar>
+              <w:top w:type="dxa" w:w="50"/>
+              <w:left w:type="dxa" w:w="100"/>
+              <w:bottom w:type="dxa" w:w="50"/>
+              <w:right w:type="dxa" w:w="100"/>
+            </w:tcMar>
+          </w:tcPr>
+          <w:p>
+            <w:pPr>
+              <w:bidi/>
+              <w:spacing w:after="0" w:before="0" w:line="276"/>
+            </w:pPr>
+            <w:r>
+              <w:rPr>
+                <w:rFonts w:ascii="Arial" w:cs="Arial" w:eastAsia="Arial" w:hAnsi="Arial"/>
+                <w:b w:val="false"/>
+                <w:bCs w:val="false"/>
+                <w:i w:val="false"/>
+                <w:iCs w:val="false"/>
+                <w:color w:val="222222"/>
+                <w:sz w:val="20"/>
+                <w:szCs w:val="20"/>
+                <w:rtl/>
+              </w:rPr>
+              <w:t xml:space="preserve">המציע אינו כופה שתיקה כקיבול — ס' 6(ב).</w:t>
+            </w:r>
+          </w:p>
+        </w:tc>
+        <w:tc>
+          <w:tcPr>
+            <w:tcW w:type="dxa" w:w="3337"/>
+            <w:tcMar>
+              <w:top w:type="dxa" w:w="50"/>
+              <w:left w:type="dxa" w:w="100"/>
+              <w:bottom w:type="dxa" w:w="50"/>
+              <w:right w:type="dxa" w:w="100"/>
+            </w:tcMar>
+          </w:tcPr>
+          <w:p>
+            <w:pPr>
+              <w:bidi/>
+              <w:spacing w:after="0" w:before="0" w:line="276"/>
+            </w:pPr>
+            <w:r>
+              <w:rPr>
+                <w:rFonts w:ascii="Arial" w:cs="Arial" w:eastAsia="Arial" w:hAnsi="Arial"/>
+                <w:b w:val="false"/>
+                <w:bCs w:val="false"/>
+                <w:i w:val="false"/>
+                <w:iCs w:val="false"/>
+                <w:color w:val="222222"/>
+                <w:sz w:val="20"/>
+                <w:szCs w:val="20"/>
+                <w:rtl/>
+              </w:rPr>
+              <w:t xml:space="preserve">הצעה מזכה — חזקת קיבול בשתיקה, ס' 7.</w:t>
+            </w:r>
+          </w:p>
+        </w:tc>
+      </w:tr>
+      <w:tr>
+        <w:tc>
+          <w:tcPr>
+            <w:tcW w:type="dxa" w:w="2345"/>
+            <w:shd w:fill="F2F6FC" w:val="clear"/>
+            <w:tcMar>
+              <w:top w:type="dxa" w:w="50"/>
+              <w:left w:type="dxa" w:w="100"/>
+              <w:bottom w:type="dxa" w:w="50"/>
+              <w:right w:type="dxa" w:w="100"/>
+            </w:tcMar>
+          </w:tcPr>
+          <w:p>
+            <w:pPr>
+              <w:bidi/>
+              <w:spacing w:after="0" w:before="0" w:line="276"/>
+            </w:pPr>
+            <w:r>
+              <w:rPr>
+                <w:rFonts w:ascii="Arial" w:cs="Arial" w:eastAsia="Arial" w:hAnsi="Arial"/>
+                <w:b w:val="false"/>
+                <w:bCs w:val="false"/>
+                <w:i w:val="false"/>
+                <w:iCs w:val="false"/>
+                <w:color w:val="222222"/>
+                <w:sz w:val="20"/>
+                <w:szCs w:val="20"/>
+                <w:rtl/>
+              </w:rPr>
+              <w:t xml:space="preserve">סעד ס' 12</w:t>
+            </w:r>
+          </w:p>
+        </w:tc>
+        <w:tc>
+          <w:tcPr>
+            <w:tcW w:type="dxa" w:w="3337"/>
+            <w:shd w:fill="F2F6FC" w:val="clear"/>
+            <w:tcMar>
+              <w:top w:type="dxa" w:w="50"/>
+              <w:left w:type="dxa" w:w="100"/>
+              <w:bottom w:type="dxa" w:w="50"/>
+              <w:right w:type="dxa" w:w="100"/>
+            </w:tcMar>
+          </w:tcPr>
+          <w:p>
+            <w:pPr>
+              <w:bidi/>
+              <w:spacing w:after="0" w:before="0" w:line="276"/>
+            </w:pPr>
+            <w:r>
+              <w:rPr>
+                <w:rFonts w:ascii="Arial" w:cs="Arial" w:eastAsia="Arial" w:hAnsi="Arial"/>
+                <w:b w:val="false"/>
+                <w:bCs w:val="false"/>
+                <w:i w:val="false"/>
+                <w:iCs w:val="false"/>
+                <w:color w:val="222222"/>
+                <w:sz w:val="20"/>
+                <w:szCs w:val="20"/>
+                <w:rtl/>
+              </w:rPr>
+              <w:t xml:space="preserve">פיצויי הסתמכות — לא ביטול.</w:t>
+            </w:r>
+          </w:p>
+        </w:tc>
+        <w:tc>
+          <w:tcPr>
+            <w:tcW w:type="dxa" w:w="3337"/>
+            <w:shd w:fill="F2F6FC" w:val="clear"/>
+            <w:tcMar>
+              <w:top w:type="dxa" w:w="50"/>
+              <w:left w:type="dxa" w:w="100"/>
+              <w:bottom w:type="dxa" w:w="50"/>
+              <w:right w:type="dxa" w:w="100"/>
+            </w:tcMar>
+          </w:tcPr>
+          <w:p>
+            <w:pPr>
+              <w:bidi/>
+              <w:spacing w:after="0" w:before="0" w:line="276"/>
+            </w:pPr>
+            <w:r>
+              <w:rPr>
+                <w:rFonts w:ascii="Arial" w:cs="Arial" w:eastAsia="Arial" w:hAnsi="Arial"/>
+                <w:b w:val="false"/>
+                <w:bCs w:val="false"/>
+                <w:i w:val="false"/>
+                <w:iCs w:val="false"/>
+                <w:color w:val="222222"/>
+                <w:sz w:val="20"/>
+                <w:szCs w:val="20"/>
+                <w:rtl/>
+              </w:rPr>
+              <w:t xml:space="preserve">חריג: פיצויי קיום (קל בניין); לעיתים אכיפה (זפניק).</w:t>
+            </w:r>
+          </w:p>
+        </w:tc>
+      </w:tr>
+    </w:tbl>
+    <w:p>
+      <w:pPr>
+        <w:pStyle w:val="Heading3"/>
+        <w:keepNext/>
+        <w:bidi/>
+        <w:spacing w:after="80" w:before="140" w:line="276"/>
+      </w:pPr>
+      <w:r>
+        <w:rPr>
+          <w:rFonts w:ascii="Arial" w:cs="Arial" w:eastAsia="Arial" w:hAnsi="Arial"/>
+          <w:b/>
+          <w:bCs/>
+          <w:i w:val="false"/>
+          <w:iCs w:val="false"/>
+          <w:color w:val="404040"/>
+          <w:sz w:val="23"/>
+          <w:szCs w:val="23"/>
+          <w:rtl/>
+        </w:rPr>
+        <w:t xml:space="preserve">3 · מפת הסעיפים בשורה</w:t>
+      </w:r>
+    </w:p>
+    <w:p>
+      <w:pPr>
+        <w:bidi/>
+        <w:spacing w:after="120" w:before="0" w:line="276"/>
+      </w:pPr>
+      <w:r>
+        <w:rPr>
+          <w:rFonts w:ascii="Arial" w:cs="Arial" w:eastAsia="Arial" w:hAnsi="Arial"/>
+          <w:b/>
+          <w:bCs/>
+          <w:i w:val="false"/>
+          <w:iCs w:val="false"/>
+          <w:color w:val="222222"/>
+          <w:sz w:val="22"/>
+          <w:szCs w:val="22"/>
+          <w:rtl/>
+        </w:rPr>
+        <w:t xml:space="preserve">1 </w:t>
+      </w:r>
+      <w:r>
+        <w:rPr>
+          <w:rFonts w:ascii="Arial" w:cs="Arial" w:eastAsia="Arial" w:hAnsi="Arial"/>
+          <w:b w:val="false"/>
+          <w:bCs w:val="false"/>
+          <w:i w:val="false"/>
+          <w:iCs w:val="false"/>
+          <w:color w:val="222222"/>
+          <w:sz w:val="22"/>
+          <w:szCs w:val="22"/>
+          <w:rtl/>
+        </w:rPr>
+        <w:t xml:space="preserve">חוזה=הצעה+קיבול · </w:t>
+      </w:r>
+      <w:r>
+        <w:rPr>
+          <w:rFonts w:ascii="Arial" w:cs="Arial" w:eastAsia="Arial" w:hAnsi="Arial"/>
+          <w:b/>
+          <w:bCs/>
+          <w:i w:val="false"/>
+          <w:iCs w:val="false"/>
+          <w:color w:val="222222"/>
+          <w:sz w:val="22"/>
+          <w:szCs w:val="22"/>
+          <w:rtl/>
+        </w:rPr>
+        <w:t xml:space="preserve">2 </w:t>
+      </w:r>
+      <w:r>
+        <w:rPr>
+          <w:rFonts w:ascii="Arial" w:cs="Arial" w:eastAsia="Arial" w:hAnsi="Arial"/>
+          <w:b w:val="false"/>
+          <w:bCs w:val="false"/>
+          <w:i w:val="false"/>
+          <w:iCs w:val="false"/>
+          <w:color w:val="222222"/>
+          <w:sz w:val="22"/>
+          <w:szCs w:val="22"/>
+          <w:rtl/>
+        </w:rPr>
+        <w:t xml:space="preserve">הצעה · </w:t>
+      </w:r>
+      <w:r>
+        <w:rPr>
+          <w:rFonts w:ascii="Arial" w:cs="Arial" w:eastAsia="Arial" w:hAnsi="Arial"/>
+          <w:b/>
+          <w:bCs/>
+          <w:i w:val="false"/>
+          <w:iCs w:val="false"/>
+          <w:color w:val="222222"/>
+          <w:sz w:val="22"/>
+          <w:szCs w:val="22"/>
+          <w:rtl/>
+        </w:rPr>
+        <w:t xml:space="preserve">3 </w:t>
+      </w:r>
+      <w:r>
+        <w:rPr>
+          <w:rFonts w:ascii="Arial" w:cs="Arial" w:eastAsia="Arial" w:hAnsi="Arial"/>
+          <w:b w:val="false"/>
+          <w:bCs w:val="false"/>
+          <w:i w:val="false"/>
+          <w:iCs w:val="false"/>
+          <w:color w:val="222222"/>
+          <w:sz w:val="22"/>
+          <w:szCs w:val="22"/>
+          <w:rtl/>
+        </w:rPr>
+        <w:t xml:space="preserve">חרטת מציע · </w:t>
+      </w:r>
+      <w:r>
+        <w:rPr>
+          <w:rFonts w:ascii="Arial" w:cs="Arial" w:eastAsia="Arial" w:hAnsi="Arial"/>
+          <w:b/>
+          <w:bCs/>
+          <w:i w:val="false"/>
+          <w:iCs w:val="false"/>
+          <w:color w:val="222222"/>
+          <w:sz w:val="22"/>
+          <w:szCs w:val="22"/>
+          <w:rtl/>
+        </w:rPr>
+        <w:t xml:space="preserve">4 </w:t>
+      </w:r>
+      <w:r>
+        <w:rPr>
+          <w:rFonts w:ascii="Arial" w:cs="Arial" w:eastAsia="Arial" w:hAnsi="Arial"/>
+          <w:b w:val="false"/>
+          <w:bCs w:val="false"/>
+          <w:i w:val="false"/>
+          <w:iCs w:val="false"/>
+          <w:color w:val="222222"/>
+          <w:sz w:val="22"/>
+          <w:szCs w:val="22"/>
+          <w:rtl/>
+        </w:rPr>
+        <w:t xml:space="preserve">פקיעה · </w:t>
+      </w:r>
+      <w:r>
+        <w:rPr>
+          <w:rFonts w:ascii="Arial" w:cs="Arial" w:eastAsia="Arial" w:hAnsi="Arial"/>
+          <w:b/>
+          <w:bCs/>
+          <w:i w:val="false"/>
+          <w:iCs w:val="false"/>
+          <w:color w:val="222222"/>
+          <w:sz w:val="22"/>
+          <w:szCs w:val="22"/>
+          <w:rtl/>
+        </w:rPr>
+        <w:t xml:space="preserve">5 </w:t>
+      </w:r>
+      <w:r>
+        <w:rPr>
+          <w:rFonts w:ascii="Arial" w:cs="Arial" w:eastAsia="Arial" w:hAnsi="Arial"/>
+          <w:b w:val="false"/>
+          <w:bCs w:val="false"/>
+          <w:i w:val="false"/>
+          <w:iCs w:val="false"/>
+          <w:color w:val="222222"/>
+          <w:sz w:val="22"/>
+          <w:szCs w:val="22"/>
+          <w:rtl/>
+        </w:rPr>
+        <w:t xml:space="preserve">קיבול · </w:t>
+      </w:r>
+      <w:r>
+        <w:rPr>
+          <w:rFonts w:ascii="Arial" w:cs="Arial" w:eastAsia="Arial" w:hAnsi="Arial"/>
+          <w:b/>
+          <w:bCs/>
+          <w:i w:val="false"/>
+          <w:iCs w:val="false"/>
+          <w:color w:val="222222"/>
+          <w:sz w:val="22"/>
+          <w:szCs w:val="22"/>
+          <w:rtl/>
+        </w:rPr>
+        <w:t xml:space="preserve">6 </w:t>
+      </w:r>
+      <w:r>
+        <w:rPr>
+          <w:rFonts w:ascii="Arial" w:cs="Arial" w:eastAsia="Arial" w:hAnsi="Arial"/>
+          <w:b w:val="false"/>
+          <w:bCs w:val="false"/>
+          <w:i w:val="false"/>
+          <w:iCs w:val="false"/>
+          <w:color w:val="222222"/>
+          <w:sz w:val="22"/>
+          <w:szCs w:val="22"/>
+          <w:rtl/>
+        </w:rPr>
+        <w:t xml:space="preserve">התנהגות/שתיקה · </w:t>
+      </w:r>
+      <w:r>
+        <w:rPr>
+          <w:rFonts w:ascii="Arial" w:cs="Arial" w:eastAsia="Arial" w:hAnsi="Arial"/>
+          <w:b/>
+          <w:bCs/>
+          <w:i w:val="false"/>
+          <w:iCs w:val="false"/>
+          <w:color w:val="222222"/>
+          <w:sz w:val="22"/>
+          <w:szCs w:val="22"/>
+          <w:rtl/>
+        </w:rPr>
+        <w:t xml:space="preserve">7 </w:t>
+      </w:r>
+      <w:r>
+        <w:rPr>
+          <w:rFonts w:ascii="Arial" w:cs="Arial" w:eastAsia="Arial" w:hAnsi="Arial"/>
+          <w:b w:val="false"/>
+          <w:bCs w:val="false"/>
+          <w:i w:val="false"/>
+          <w:iCs w:val="false"/>
+          <w:color w:val="222222"/>
+          <w:sz w:val="22"/>
+          <w:szCs w:val="22"/>
+          <w:rtl/>
+        </w:rPr>
+        <w:t xml:space="preserve">הצעה מזכה · </w:t>
+      </w:r>
+      <w:r>
+        <w:rPr>
+          <w:rFonts w:ascii="Arial" w:cs="Arial" w:eastAsia="Arial" w:hAnsi="Arial"/>
+          <w:b/>
+          <w:bCs/>
+          <w:i w:val="false"/>
+          <w:iCs w:val="false"/>
+          <w:color w:val="222222"/>
+          <w:sz w:val="22"/>
+          <w:szCs w:val="22"/>
+          <w:rtl/>
+        </w:rPr>
+        <w:t xml:space="preserve">8 </w:t>
+      </w:r>
+      <w:r>
+        <w:rPr>
+          <w:rFonts w:ascii="Arial" w:cs="Arial" w:eastAsia="Arial" w:hAnsi="Arial"/>
+          <w:b w:val="false"/>
+          <w:bCs w:val="false"/>
+          <w:i w:val="false"/>
+          <w:iCs w:val="false"/>
+          <w:color w:val="222222"/>
+          <w:sz w:val="22"/>
+          <w:szCs w:val="22"/>
+          <w:rtl/>
+        </w:rPr>
+        <w:t xml:space="preserve">מועד · </w:t>
+      </w:r>
+      <w:r>
+        <w:rPr>
+          <w:rFonts w:ascii="Arial" w:cs="Arial" w:eastAsia="Arial" w:hAnsi="Arial"/>
+          <w:b/>
+          <w:bCs/>
+          <w:i w:val="false"/>
+          <w:iCs w:val="false"/>
+          <w:color w:val="222222"/>
+          <w:sz w:val="22"/>
+          <w:szCs w:val="22"/>
+          <w:rtl/>
+        </w:rPr>
+        <w:t xml:space="preserve">9 </w:t>
+      </w:r>
+      <w:r>
+        <w:rPr>
+          <w:rFonts w:ascii="Arial" w:cs="Arial" w:eastAsia="Arial" w:hAnsi="Arial"/>
+          <w:b w:val="false"/>
+          <w:bCs w:val="false"/>
+          <w:i w:val="false"/>
+          <w:iCs w:val="false"/>
+          <w:color w:val="222222"/>
+          <w:sz w:val="22"/>
+          <w:szCs w:val="22"/>
+          <w:rtl/>
+        </w:rPr>
+        <w:t xml:space="preserve">קיבול אחרי פקיעה · </w:t>
+      </w:r>
+      <w:r>
+        <w:rPr>
+          <w:rFonts w:ascii="Arial" w:cs="Arial" w:eastAsia="Arial" w:hAnsi="Arial"/>
+          <w:b/>
+          <w:bCs/>
+          <w:i w:val="false"/>
+          <w:iCs w:val="false"/>
+          <w:color w:val="222222"/>
+          <w:sz w:val="22"/>
+          <w:szCs w:val="22"/>
+          <w:rtl/>
+        </w:rPr>
+        <w:t xml:space="preserve">10 </w:t>
+      </w:r>
+      <w:r>
+        <w:rPr>
+          <w:rFonts w:ascii="Arial" w:cs="Arial" w:eastAsia="Arial" w:hAnsi="Arial"/>
+          <w:b w:val="false"/>
+          <w:bCs w:val="false"/>
+          <w:i w:val="false"/>
+          <w:iCs w:val="false"/>
+          <w:color w:val="222222"/>
+          <w:sz w:val="22"/>
+          <w:szCs w:val="22"/>
+          <w:rtl/>
+        </w:rPr>
+        <w:t xml:space="preserve">חרטת ניצע · </w:t>
+      </w:r>
+      <w:r>
+        <w:rPr>
+          <w:rFonts w:ascii="Arial" w:cs="Arial" w:eastAsia="Arial" w:hAnsi="Arial"/>
+          <w:b/>
+          <w:bCs/>
+          <w:i w:val="false"/>
+          <w:iCs w:val="false"/>
+          <w:color w:val="222222"/>
+          <w:sz w:val="22"/>
+          <w:szCs w:val="22"/>
+          <w:rtl/>
+        </w:rPr>
+        <w:t xml:space="preserve">11 </w:t>
+      </w:r>
+      <w:r>
+        <w:rPr>
+          <w:rFonts w:ascii="Arial" w:cs="Arial" w:eastAsia="Arial" w:hAnsi="Arial"/>
+          <w:b w:val="false"/>
+          <w:bCs w:val="false"/>
+          <w:i w:val="false"/>
+          <w:iCs w:val="false"/>
+          <w:color w:val="222222"/>
+          <w:sz w:val="22"/>
+          <w:szCs w:val="22"/>
+          <w:rtl/>
+        </w:rPr>
+        <w:t xml:space="preserve">קיבול תוך שינוי · </w:t>
+      </w:r>
+      <w:r>
+        <w:rPr>
+          <w:rFonts w:ascii="Arial" w:cs="Arial" w:eastAsia="Arial" w:hAnsi="Arial"/>
+          <w:b/>
+          <w:bCs/>
+          <w:i w:val="false"/>
+          <w:iCs w:val="false"/>
+          <w:color w:val="222222"/>
+          <w:sz w:val="22"/>
+          <w:szCs w:val="22"/>
+          <w:rtl/>
+        </w:rPr>
+        <w:t xml:space="preserve">12 </w:t>
+      </w:r>
+      <w:r>
+        <w:rPr>
+          <w:rFonts w:ascii="Arial" w:cs="Arial" w:eastAsia="Arial" w:hAnsi="Arial"/>
+          <w:b w:val="false"/>
+          <w:bCs w:val="false"/>
+          <w:i w:val="false"/>
+          <w:iCs w:val="false"/>
+          <w:color w:val="222222"/>
+          <w:sz w:val="22"/>
+          <w:szCs w:val="22"/>
+          <w:rtl/>
+        </w:rPr>
+        <w:t xml:space="preserve">תום לב · </w:t>
+      </w:r>
+      <w:r>
+        <w:rPr>
+          <w:rFonts w:ascii="Arial" w:cs="Arial" w:eastAsia="Arial" w:hAnsi="Arial"/>
+          <w:b/>
+          <w:bCs/>
+          <w:i w:val="false"/>
+          <w:iCs w:val="false"/>
+          <w:color w:val="222222"/>
+          <w:sz w:val="22"/>
+          <w:szCs w:val="22"/>
+          <w:rtl/>
+        </w:rPr>
+        <w:t xml:space="preserve">14 </w:t>
+      </w:r>
+      <w:r>
+        <w:rPr>
+          <w:rFonts w:ascii="Arial" w:cs="Arial" w:eastAsia="Arial" w:hAnsi="Arial"/>
+          <w:b w:val="false"/>
+          <w:bCs w:val="false"/>
+          <w:i w:val="false"/>
+          <w:iCs w:val="false"/>
+          <w:color w:val="222222"/>
+          <w:sz w:val="22"/>
+          <w:szCs w:val="22"/>
+          <w:rtl/>
+        </w:rPr>
+        <w:t xml:space="preserve">טעות · </w:t>
+      </w:r>
+      <w:r>
+        <w:rPr>
+          <w:rFonts w:ascii="Arial" w:cs="Arial" w:eastAsia="Arial" w:hAnsi="Arial"/>
+          <w:b/>
+          <w:bCs/>
+          <w:i w:val="false"/>
+          <w:iCs w:val="false"/>
+          <w:color w:val="222222"/>
+          <w:sz w:val="22"/>
+          <w:szCs w:val="22"/>
+          <w:rtl/>
+        </w:rPr>
+        <w:t xml:space="preserve">15 </w:t>
+      </w:r>
+      <w:r>
+        <w:rPr>
+          <w:rFonts w:ascii="Arial" w:cs="Arial" w:eastAsia="Arial" w:hAnsi="Arial"/>
+          <w:b w:val="false"/>
+          <w:bCs w:val="false"/>
+          <w:i w:val="false"/>
+          <w:iCs w:val="false"/>
+          <w:color w:val="222222"/>
+          <w:sz w:val="22"/>
+          <w:szCs w:val="22"/>
+          <w:rtl/>
+        </w:rPr>
+        <w:t xml:space="preserve">הטעיה · </w:t>
+      </w:r>
+      <w:r>
+        <w:rPr>
+          <w:rFonts w:ascii="Arial" w:cs="Arial" w:eastAsia="Arial" w:hAnsi="Arial"/>
+          <w:b/>
+          <w:bCs/>
+          <w:i w:val="false"/>
+          <w:iCs w:val="false"/>
+          <w:color w:val="222222"/>
+          <w:sz w:val="22"/>
+          <w:szCs w:val="22"/>
+          <w:rtl/>
+        </w:rPr>
+        <w:t xml:space="preserve">19 </w:t>
+      </w:r>
+      <w:r>
+        <w:rPr>
+          <w:rFonts w:ascii="Arial" w:cs="Arial" w:eastAsia="Arial" w:hAnsi="Arial"/>
+          <w:b w:val="false"/>
+          <w:bCs w:val="false"/>
+          <w:i w:val="false"/>
+          <w:iCs w:val="false"/>
+          <w:color w:val="222222"/>
+          <w:sz w:val="22"/>
+          <w:szCs w:val="22"/>
+          <w:rtl/>
+        </w:rPr>
+        <w:t xml:space="preserve">ביטול חלקי · </w:t>
+      </w:r>
+      <w:r>
+        <w:rPr>
+          <w:rFonts w:ascii="Arial" w:cs="Arial" w:eastAsia="Arial" w:hAnsi="Arial"/>
+          <w:b/>
+          <w:bCs/>
+          <w:i w:val="false"/>
+          <w:iCs w:val="false"/>
+          <w:color w:val="222222"/>
+          <w:sz w:val="22"/>
+          <w:szCs w:val="22"/>
+          <w:rtl/>
+        </w:rPr>
+        <w:t xml:space="preserve">20 </w:t>
+      </w:r>
+      <w:r>
+        <w:rPr>
+          <w:rFonts w:ascii="Arial" w:cs="Arial" w:eastAsia="Arial" w:hAnsi="Arial"/>
+          <w:b w:val="false"/>
+          <w:bCs w:val="false"/>
+          <w:i w:val="false"/>
+          <w:iCs w:val="false"/>
+          <w:color w:val="222222"/>
+          <w:sz w:val="22"/>
+          <w:szCs w:val="22"/>
+          <w:rtl/>
+        </w:rPr>
+        <w:t xml:space="preserve">דרך הביטול · </w:t>
+      </w:r>
+      <w:r>
+        <w:rPr>
+          <w:rFonts w:ascii="Arial" w:cs="Arial" w:eastAsia="Arial" w:hAnsi="Arial"/>
+          <w:b/>
+          <w:bCs/>
+          <w:i w:val="false"/>
+          <w:iCs w:val="false"/>
+          <w:color w:val="222222"/>
+          <w:sz w:val="22"/>
+          <w:szCs w:val="22"/>
+          <w:rtl/>
+        </w:rPr>
+        <w:t xml:space="preserve">21 </w:t>
+      </w:r>
+      <w:r>
+        <w:rPr>
+          <w:rFonts w:ascii="Arial" w:cs="Arial" w:eastAsia="Arial" w:hAnsi="Arial"/>
+          <w:b w:val="false"/>
+          <w:bCs w:val="false"/>
+          <w:i w:val="false"/>
+          <w:iCs w:val="false"/>
+          <w:color w:val="222222"/>
+          <w:sz w:val="22"/>
+          <w:szCs w:val="22"/>
+          <w:rtl/>
+        </w:rPr>
+        <w:t xml:space="preserve">השבה · </w:t>
+      </w:r>
+      <w:r>
+        <w:rPr>
+          <w:rFonts w:ascii="Arial" w:cs="Arial" w:eastAsia="Arial" w:hAnsi="Arial"/>
+          <w:b/>
+          <w:bCs/>
+          <w:i w:val="false"/>
+          <w:iCs w:val="false"/>
+          <w:color w:val="222222"/>
+          <w:sz w:val="22"/>
+          <w:szCs w:val="22"/>
+          <w:rtl/>
+        </w:rPr>
+        <w:t xml:space="preserve">22 </w:t>
+      </w:r>
+      <w:r>
+        <w:rPr>
+          <w:rFonts w:ascii="Arial" w:cs="Arial" w:eastAsia="Arial" w:hAnsi="Arial"/>
+          <w:b w:val="false"/>
+          <w:bCs w:val="false"/>
+          <w:i w:val="false"/>
+          <w:iCs w:val="false"/>
+          <w:color w:val="222222"/>
+          <w:sz w:val="22"/>
+          <w:szCs w:val="22"/>
+          <w:rtl/>
+        </w:rPr>
+        <w:t xml:space="preserve">שמירת תרופות · </w:t>
+      </w:r>
+      <w:r>
+        <w:rPr>
+          <w:rFonts w:ascii="Arial" w:cs="Arial" w:eastAsia="Arial" w:hAnsi="Arial"/>
+          <w:b/>
+          <w:bCs/>
+          <w:i w:val="false"/>
+          <w:iCs w:val="false"/>
+          <w:color w:val="222222"/>
+          <w:sz w:val="22"/>
+          <w:szCs w:val="22"/>
+          <w:rtl/>
+        </w:rPr>
+        <w:t xml:space="preserve">23 </w:t>
+      </w:r>
+      <w:r>
+        <w:rPr>
+          <w:rFonts w:ascii="Arial" w:cs="Arial" w:eastAsia="Arial" w:hAnsi="Arial"/>
+          <w:b w:val="false"/>
+          <w:bCs w:val="false"/>
+          <w:i w:val="false"/>
+          <w:iCs w:val="false"/>
+          <w:color w:val="222222"/>
+          <w:sz w:val="22"/>
+          <w:szCs w:val="22"/>
+          <w:rtl/>
+        </w:rPr>
+        <w:t xml:space="preserve">צורה · </w:t>
+      </w:r>
+      <w:r>
+        <w:rPr>
+          <w:rFonts w:ascii="Arial" w:cs="Arial" w:eastAsia="Arial" w:hAnsi="Arial"/>
+          <w:b/>
+          <w:bCs/>
+          <w:i w:val="false"/>
+          <w:iCs w:val="false"/>
+          <w:color w:val="222222"/>
+          <w:sz w:val="22"/>
+          <w:szCs w:val="22"/>
+          <w:rtl/>
+        </w:rPr>
+        <w:t xml:space="preserve">26 </w:t>
+      </w:r>
+      <w:r>
+        <w:rPr>
+          <w:rFonts w:ascii="Arial" w:cs="Arial" w:eastAsia="Arial" w:hAnsi="Arial"/>
+          <w:b w:val="false"/>
+          <w:bCs w:val="false"/>
+          <w:i w:val="false"/>
+          <w:iCs w:val="false"/>
+          <w:color w:val="222222"/>
+          <w:sz w:val="22"/>
+          <w:szCs w:val="22"/>
+          <w:rtl/>
+        </w:rPr>
+        <w:t xml:space="preserve">השלמה · </w:t>
+      </w:r>
+      <w:r>
+        <w:rPr>
+          <w:rFonts w:ascii="Arial" w:cs="Arial" w:eastAsia="Arial" w:hAnsi="Arial"/>
+          <w:b/>
+          <w:bCs/>
+          <w:i w:val="false"/>
+          <w:iCs w:val="false"/>
+          <w:color w:val="222222"/>
+          <w:sz w:val="22"/>
+          <w:szCs w:val="22"/>
+          <w:rtl/>
+        </w:rPr>
+        <w:t xml:space="preserve">30 </w:t>
+      </w:r>
+      <w:r>
+        <w:rPr>
+          <w:rFonts w:ascii="Arial" w:cs="Arial" w:eastAsia="Arial" w:hAnsi="Arial"/>
+          <w:b w:val="false"/>
+          <w:bCs w:val="false"/>
+          <w:i w:val="false"/>
+          <w:iCs w:val="false"/>
+          <w:color w:val="222222"/>
+          <w:sz w:val="22"/>
+          <w:szCs w:val="22"/>
+          <w:rtl/>
+        </w:rPr>
+        <w:t xml:space="preserve">חוזה פסול</w:t>
+      </w:r>
+    </w:p>
+    <w:p>
+      <w:pPr>
+        <w:pStyle w:val="Heading3"/>
+        <w:keepNext/>
+        <w:bidi/>
+        <w:spacing w:after="80" w:before="140" w:line="276"/>
+      </w:pPr>
+      <w:r>
+        <w:rPr>
+          <w:rFonts w:ascii="Arial" w:cs="Arial" w:eastAsia="Arial" w:hAnsi="Arial"/>
+          <w:b/>
+          <w:bCs/>
+          <w:i w:val="false"/>
+          <w:iCs w:val="false"/>
+          <w:color w:val="404040"/>
+          <w:sz w:val="23"/>
+          <w:szCs w:val="23"/>
+          <w:rtl/>
+        </w:rPr>
+        <w:t xml:space="preserve">4 · אזהרת "מילים מוחלטות"</w:t>
+      </w:r>
+    </w:p>
+    <w:p>
+      <w:pPr>
+        <w:shd w:fill="FFF6E0" w:val="clear"/>
+        <w:bidi/>
+        <w:spacing w:after="120" w:before="0" w:line="276"/>
+        <w:ind w:left="150" w:right="150"/>
+      </w:pPr>
+      <w:r>
+        <w:rPr>
+          <w:rFonts w:ascii="Arial" w:cs="Arial" w:eastAsia="Arial" w:hAnsi="Arial"/>
+          <w:b/>
+          <w:bCs/>
+          <w:i w:val="false"/>
+          <w:iCs w:val="false"/>
+          <w:color w:val="222222"/>
+          <w:sz w:val="22"/>
+          <w:szCs w:val="22"/>
+          <w:rtl/>
+        </w:rPr>
+        <w:t xml:space="preserve">ראית "תמיד" / "רק" / "בכל מקרה" / "כל פרט" / "אינו יכול" — עצור. </w:t>
+      </w:r>
+      <w:r>
+        <w:rPr>
+          <w:rFonts w:ascii="Arial" w:cs="Arial" w:eastAsia="Arial" w:hAnsi="Arial"/>
+          <w:b w:val="false"/>
+          <w:bCs w:val="false"/>
+          <w:i w:val="false"/>
+          <w:iCs w:val="false"/>
+          <w:color w:val="222222"/>
+          <w:sz w:val="22"/>
+          <w:szCs w:val="22"/>
+          <w:rtl/>
+        </w:rPr>
+        <w:t xml:space="preserve">כמעט תמיד ההיגד לא נכון, והחריג הוא בדיוק הנימוק שלך.</w:t>
       </w:r>
     </w:p>
     <w:p>
@@ -12624,6 +14174,1570 @@
           <w:rtl/>
         </w:rPr>
         <w:t xml:space="preserve">ביטול בהודעה תוך זמן סביר (ס׳ 20) + השבה (ס׳ 21); ובמצטבר פיצויי הסתמכות מכוח ס׳ 12(ב) (ס׳ 22 — שמירת תרופות). הפחתת שכר חד-צדדית אינה סעד.</w:t>
+      </w:r>
+    </w:p>
+    <w:p>
+      <w:r>
+        <w:br w:type="page"/>
+      </w:r>
+    </w:p>
+    <w:p>
+      <w:pPr>
+        <w:pStyle w:val="Heading1"/>
+        <w:keepNext/>
+        <w:bidi/>
+        <w:spacing w:after="160" w:before="240" w:line="276"/>
+      </w:pPr>
+      <w:r>
+        <w:rPr>
+          <w:rFonts w:ascii="Arial" w:cs="Arial" w:eastAsia="Arial" w:hAnsi="Arial"/>
+          <w:b/>
+          <w:bCs/>
+          <w:i w:val="false"/>
+          <w:iCs w:val="false"/>
+          <w:color w:val="1F3864"/>
+          <w:sz w:val="32"/>
+          <w:szCs w:val="32"/>
+          <w:rtl/>
+        </w:rPr>
+        <w:t xml:space="preserve">נספח חקיקה — לשון הסעיפים לציטוט מדויק</w:t>
+      </w:r>
+    </w:p>
+    <w:p>
+      <w:pPr>
+        <w:shd w:fill="FFF6E0" w:val="clear"/>
+        <w:bidi/>
+        <w:spacing w:after="120" w:before="0" w:line="276"/>
+        <w:ind w:left="150" w:right="150"/>
+      </w:pPr>
+      <w:r>
+        <w:rPr>
+          <w:rFonts w:ascii="Arial" w:cs="Arial" w:eastAsia="Arial" w:hAnsi="Arial"/>
+          <w:b/>
+          <w:bCs/>
+          <w:i w:val="false"/>
+          <w:iCs w:val="false"/>
+          <w:color w:val="222222"/>
+          <w:sz w:val="22"/>
+          <w:szCs w:val="22"/>
+          <w:rtl/>
+        </w:rPr>
+        <w:t xml:space="preserve">הסעיפים שלהלן מובאים כלשונם מהמצגות של המרצה. </w:t>
+      </w:r>
+      <w:r>
+        <w:rPr>
+          <w:rFonts w:ascii="Arial" w:cs="Arial" w:eastAsia="Arial" w:hAnsi="Arial"/>
+          <w:b w:val="false"/>
+          <w:bCs w:val="false"/>
+          <w:i w:val="false"/>
+          <w:iCs w:val="false"/>
+          <w:color w:val="222222"/>
+          <w:sz w:val="22"/>
+          <w:szCs w:val="22"/>
+          <w:rtl/>
+        </w:rPr>
+        <w:t xml:space="preserve">סעיפים המסומנים [תמצית] מנוסחים בתמצית — ציין בבחינה את מספר הסעיף, ואם נדרש ציטוט מילולי מדויק היעזר בקובץ החקיקה המודפס.</w:t>
+      </w:r>
+    </w:p>
+    <w:p>
+      <w:pPr>
+        <w:pStyle w:val="Heading2"/>
+        <w:keepNext/>
+        <w:bidi/>
+        <w:spacing w:after="120" w:before="200" w:line="276"/>
+      </w:pPr>
+      <w:r>
+        <w:rPr>
+          <w:rFonts w:ascii="Arial" w:cs="Arial" w:eastAsia="Arial" w:hAnsi="Arial"/>
+          <w:b/>
+          <w:bCs/>
+          <w:i w:val="false"/>
+          <w:iCs w:val="false"/>
+          <w:color w:val="2E5395"/>
+          <w:sz w:val="27"/>
+          <w:szCs w:val="27"/>
+          <w:rtl/>
+        </w:rPr>
+        <w:t xml:space="preserve">כריתת החוזה</w:t>
+      </w:r>
+    </w:p>
+    <w:p>
+      <w:pPr>
+        <w:keepNext/>
+        <w:bidi/>
+        <w:spacing w:after="20" w:before="0" w:line="276"/>
+      </w:pPr>
+      <w:r>
+        <w:rPr>
+          <w:rFonts w:ascii="Arial" w:cs="Arial" w:eastAsia="Arial" w:hAnsi="Arial"/>
+          <w:b/>
+          <w:bCs/>
+          <w:i w:val="false"/>
+          <w:iCs w:val="false"/>
+          <w:color w:val="2E5395"/>
+          <w:sz w:val="23"/>
+          <w:szCs w:val="23"/>
+          <w:rtl/>
+        </w:rPr>
+        <w:t xml:space="preserve">ס' 2 — הצעה</w:t>
+      </w:r>
+    </w:p>
+    <w:p>
+      <w:pPr>
+        <w:shd w:fill="F2F2F2" w:val="clear"/>
+        <w:bidi/>
+        <w:spacing w:after="120" w:before="0" w:line="276"/>
+        <w:ind w:left="200" w:right="200"/>
+      </w:pPr>
+      <w:r>
+        <w:rPr>
+          <w:rFonts w:ascii="Arial" w:cs="Arial" w:eastAsia="Arial" w:hAnsi="Arial"/>
+          <w:b w:val="false"/>
+          <w:bCs w:val="false"/>
+          <w:i/>
+          <w:iCs/>
+          <w:color w:val="333333"/>
+          <w:sz w:val="22"/>
+          <w:szCs w:val="22"/>
+          <w:rtl/>
+        </w:rPr>
+        <w:t xml:space="preserve">"פנייתו של אדם לחברו היא בגדר הצעה, אם היא מעידה על גמירת דעתו של המציע להתקשר עם הניצע בחוזה והיא מסויימת כדי אפשרות לכרות את החוזה בקיבול ההצעה; הפניה יכול שתהיה לציבור."</w:t>
+      </w:r>
+    </w:p>
+    <w:p>
+      <w:pPr>
+        <w:keepNext/>
+        <w:bidi/>
+        <w:spacing w:after="20" w:before="0" w:line="276"/>
+      </w:pPr>
+      <w:r>
+        <w:rPr>
+          <w:rFonts w:ascii="Arial" w:cs="Arial" w:eastAsia="Arial" w:hAnsi="Arial"/>
+          <w:b/>
+          <w:bCs/>
+          <w:i w:val="false"/>
+          <w:iCs w:val="false"/>
+          <w:color w:val="2E5395"/>
+          <w:sz w:val="23"/>
+          <w:szCs w:val="23"/>
+          <w:rtl/>
+        </w:rPr>
+        <w:t xml:space="preserve">ס' 3 — חזרה מן ההצעה</w:t>
+      </w:r>
+    </w:p>
+    <w:p>
+      <w:pPr>
+        <w:shd w:fill="F2F2F2" w:val="clear"/>
+        <w:bidi/>
+        <w:spacing w:after="120" w:before="0" w:line="276"/>
+        <w:ind w:left="200" w:right="200"/>
+      </w:pPr>
+      <w:r>
+        <w:rPr>
+          <w:rFonts w:ascii="Arial" w:cs="Arial" w:eastAsia="Arial" w:hAnsi="Arial"/>
+          <w:b w:val="false"/>
+          <w:bCs w:val="false"/>
+          <w:i/>
+          <w:iCs/>
+          <w:color w:val="333333"/>
+          <w:sz w:val="22"/>
+          <w:szCs w:val="22"/>
+          <w:rtl/>
+        </w:rPr>
+        <w:t xml:space="preserve">(א) "המציע רשאי לחזור בו מן ההצעה בהודעה לניצע, ובלבד שהודעת החזרה נמסרה לניצע לפני שנתן הודעת קיבול." (ב) "קבע המציע שהצעתו היא ללא חזרה, או שקבע מועד לקיבולה, אין הוא רשאי לחזור בו ממנה לאחר שנמסרה לניצע."</w:t>
+      </w:r>
+    </w:p>
+    <w:p>
+      <w:pPr>
+        <w:keepNext/>
+        <w:bidi/>
+        <w:spacing w:after="20" w:before="0" w:line="276"/>
+      </w:pPr>
+      <w:r>
+        <w:rPr>
+          <w:rFonts w:ascii="Arial" w:cs="Arial" w:eastAsia="Arial" w:hAnsi="Arial"/>
+          <w:b/>
+          <w:bCs/>
+          <w:i w:val="false"/>
+          <w:iCs w:val="false"/>
+          <w:color w:val="2E5395"/>
+          <w:sz w:val="23"/>
+          <w:szCs w:val="23"/>
+          <w:rtl/>
+        </w:rPr>
+        <w:t xml:space="preserve">ס' 4 — פקיעת ההצעה</w:t>
+      </w:r>
+    </w:p>
+    <w:p>
+      <w:pPr>
+        <w:shd w:fill="F2F2F2" w:val="clear"/>
+        <w:bidi/>
+        <w:spacing w:after="120" w:before="0" w:line="276"/>
+        <w:ind w:left="200" w:right="200"/>
+      </w:pPr>
+      <w:r>
+        <w:rPr>
+          <w:rFonts w:ascii="Arial" w:cs="Arial" w:eastAsia="Arial" w:hAnsi="Arial"/>
+          <w:b w:val="false"/>
+          <w:bCs w:val="false"/>
+          <w:i/>
+          <w:iCs/>
+          <w:color w:val="333333"/>
+          <w:sz w:val="22"/>
+          <w:szCs w:val="22"/>
+          <w:rtl/>
+        </w:rPr>
+        <w:t xml:space="preserve">"ההצעה פוקעת — (1) כשדחה אותה הניצע או עבר המועד לקיבולה; (2) כשמת המציע או הניצע או כשנעשה אחד מהם פסול-דין או ניתן נגדו צו לקבלת נכסים או צו פירוק, והכל לפני מתן הודעת הקיבול."</w:t>
+      </w:r>
+    </w:p>
+    <w:p>
+      <w:pPr>
+        <w:keepNext/>
+        <w:bidi/>
+        <w:spacing w:after="20" w:before="0" w:line="276"/>
+      </w:pPr>
+      <w:r>
+        <w:rPr>
+          <w:rFonts w:ascii="Arial" w:cs="Arial" w:eastAsia="Arial" w:hAnsi="Arial"/>
+          <w:b/>
+          <w:bCs/>
+          <w:i w:val="false"/>
+          <w:iCs w:val="false"/>
+          <w:color w:val="2E5395"/>
+          <w:sz w:val="23"/>
+          <w:szCs w:val="23"/>
+          <w:rtl/>
+        </w:rPr>
+        <w:t xml:space="preserve">ס' 5 — הקיבול</w:t>
+      </w:r>
+    </w:p>
+    <w:p>
+      <w:pPr>
+        <w:shd w:fill="F2F2F2" w:val="clear"/>
+        <w:bidi/>
+        <w:spacing w:after="120" w:before="0" w:line="276"/>
+        <w:ind w:left="200" w:right="200"/>
+      </w:pPr>
+      <w:r>
+        <w:rPr>
+          <w:rFonts w:ascii="Arial" w:cs="Arial" w:eastAsia="Arial" w:hAnsi="Arial"/>
+          <w:b w:val="false"/>
+          <w:bCs w:val="false"/>
+          <w:i/>
+          <w:iCs/>
+          <w:color w:val="333333"/>
+          <w:sz w:val="22"/>
+          <w:szCs w:val="22"/>
+          <w:rtl/>
+        </w:rPr>
+        <w:t xml:space="preserve">"הקיבול יהיה בהודעת הניצע שנמסרה למציע ומעידה על גמירת דעתו של הניצע להתקשר עם המציע בחוזה לפי ההצעה."</w:t>
+      </w:r>
+    </w:p>
+    <w:p>
+      <w:pPr>
+        <w:keepNext/>
+        <w:bidi/>
+        <w:spacing w:after="20" w:before="0" w:line="276"/>
+      </w:pPr>
+      <w:r>
+        <w:rPr>
+          <w:rFonts w:ascii="Arial" w:cs="Arial" w:eastAsia="Arial" w:hAnsi="Arial"/>
+          <w:b/>
+          <w:bCs/>
+          <w:i w:val="false"/>
+          <w:iCs w:val="false"/>
+          <w:color w:val="2E5395"/>
+          <w:sz w:val="23"/>
+          <w:szCs w:val="23"/>
+          <w:rtl/>
+        </w:rPr>
+        <w:t xml:space="preserve">ס' 6 — קיבול בהתנהגות ובשתיקה</w:t>
+      </w:r>
+    </w:p>
+    <w:p>
+      <w:pPr>
+        <w:shd w:fill="F2F2F2" w:val="clear"/>
+        <w:bidi/>
+        <w:spacing w:after="120" w:before="0" w:line="276"/>
+        <w:ind w:left="200" w:right="200"/>
+      </w:pPr>
+      <w:r>
+        <w:rPr>
+          <w:rFonts w:ascii="Arial" w:cs="Arial" w:eastAsia="Arial" w:hAnsi="Arial"/>
+          <w:b w:val="false"/>
+          <w:bCs w:val="false"/>
+          <w:i/>
+          <w:iCs/>
+          <w:color w:val="333333"/>
+          <w:sz w:val="22"/>
+          <w:szCs w:val="22"/>
+          <w:rtl/>
+        </w:rPr>
+        <w:t xml:space="preserve">(א) "הקיבול יכול שיהיה במעשה לביצוע החוזה או בהתנהגות אחרת, אם דרכים אלה של קיבול משתמעות מן ההצעה; ולענין סעיפים 3(א) ו-4(2), התנהגות כאמור דינה כדין מתן הודעת קיבול." (ב) "קביעת המציע שהעדר תגובה מצד הניצע ייחשב לקיבול, אין לה תוקף."</w:t>
+      </w:r>
+    </w:p>
+    <w:p>
+      <w:pPr>
+        <w:keepNext/>
+        <w:bidi/>
+        <w:spacing w:after="20" w:before="0" w:line="276"/>
+      </w:pPr>
+      <w:r>
+        <w:rPr>
+          <w:rFonts w:ascii="Arial" w:cs="Arial" w:eastAsia="Arial" w:hAnsi="Arial"/>
+          <w:b/>
+          <w:bCs/>
+          <w:i w:val="false"/>
+          <w:iCs w:val="false"/>
+          <w:color w:val="2E5395"/>
+          <w:sz w:val="23"/>
+          <w:szCs w:val="23"/>
+          <w:rtl/>
+        </w:rPr>
+        <w:t xml:space="preserve">ס' 7 — הצעה מזכה</w:t>
+      </w:r>
+    </w:p>
+    <w:p>
+      <w:pPr>
+        <w:shd w:fill="F2F2F2" w:val="clear"/>
+        <w:bidi/>
+        <w:spacing w:after="120" w:before="0" w:line="276"/>
+        <w:ind w:left="200" w:right="200"/>
+      </w:pPr>
+      <w:r>
+        <w:rPr>
+          <w:rFonts w:ascii="Arial" w:cs="Arial" w:eastAsia="Arial" w:hAnsi="Arial"/>
+          <w:b w:val="false"/>
+          <w:bCs w:val="false"/>
+          <w:i/>
+          <w:iCs/>
+          <w:color w:val="333333"/>
+          <w:sz w:val="22"/>
+          <w:szCs w:val="22"/>
+          <w:rtl/>
+        </w:rPr>
+        <w:t xml:space="preserve">"הצעה שאין בה אלא כדי לזכות את הניצע, חזקה עליו שקיבל אותה, זולת אם הודיע למציע על התנגדותו תוך זמן סביר לאחר שנודע לו עליה."</w:t>
+      </w:r>
+    </w:p>
+    <w:p>
+      <w:pPr>
+        <w:keepNext/>
+        <w:bidi/>
+        <w:spacing w:after="20" w:before="0" w:line="276"/>
+      </w:pPr>
+      <w:r>
+        <w:rPr>
+          <w:rFonts w:ascii="Arial" w:cs="Arial" w:eastAsia="Arial" w:hAnsi="Arial"/>
+          <w:b/>
+          <w:bCs/>
+          <w:i w:val="false"/>
+          <w:iCs w:val="false"/>
+          <w:color w:val="2E5395"/>
+          <w:sz w:val="23"/>
+          <w:szCs w:val="23"/>
+          <w:rtl/>
+        </w:rPr>
+        <w:t xml:space="preserve">ס' 8 — מועד הקיבול</w:t>
+      </w:r>
+    </w:p>
+    <w:p>
+      <w:pPr>
+        <w:shd w:fill="F2F2F2" w:val="clear"/>
+        <w:bidi/>
+        <w:spacing w:after="120" w:before="0" w:line="276"/>
+        <w:ind w:left="200" w:right="200"/>
+      </w:pPr>
+      <w:r>
+        <w:rPr>
+          <w:rFonts w:ascii="Arial" w:cs="Arial" w:eastAsia="Arial" w:hAnsi="Arial"/>
+          <w:b w:val="false"/>
+          <w:bCs w:val="false"/>
+          <w:i/>
+          <w:iCs/>
+          <w:color w:val="333333"/>
+          <w:sz w:val="22"/>
+          <w:szCs w:val="22"/>
+          <w:rtl/>
+        </w:rPr>
+        <w:t xml:space="preserve">(א) "אין לקבל הצעה אלא תוך התקופה שנקבעה לכך בהצעה, ובאין תקופה כזאת — תוך זמן סביר." (ב) "נתן הניצע הודעת קיבול בעוד מועד, אך הודעתו נמסרה למציע באיחור מחמת סיבה שאינה תלויה בניצע ולא היתה ידועה לו, נכרת החוזה, זולת אם הודיע המציע לניצע על דחיית הקיבול מיד לאחר שנמסרה לו הודעת הקיבול."</w:t>
+      </w:r>
+    </w:p>
+    <w:p>
+      <w:pPr>
+        <w:keepNext/>
+        <w:bidi/>
+        <w:spacing w:after="20" w:before="0" w:line="276"/>
+      </w:pPr>
+      <w:r>
+        <w:rPr>
+          <w:rFonts w:ascii="Arial" w:cs="Arial" w:eastAsia="Arial" w:hAnsi="Arial"/>
+          <w:b/>
+          <w:bCs/>
+          <w:i w:val="false"/>
+          <w:iCs w:val="false"/>
+          <w:color w:val="2E5395"/>
+          <w:sz w:val="23"/>
+          <w:szCs w:val="23"/>
+          <w:rtl/>
+        </w:rPr>
+        <w:t xml:space="preserve">ס' 9 — קיבול לאחר פקיעה</w:t>
+      </w:r>
+    </w:p>
+    <w:p>
+      <w:pPr>
+        <w:shd w:fill="F2F2F2" w:val="clear"/>
+        <w:bidi/>
+        <w:spacing w:after="120" w:before="0" w:line="276"/>
+        <w:ind w:left="200" w:right="200"/>
+      </w:pPr>
+      <w:r>
+        <w:rPr>
+          <w:rFonts w:ascii="Arial" w:cs="Arial" w:eastAsia="Arial" w:hAnsi="Arial"/>
+          <w:b w:val="false"/>
+          <w:bCs w:val="false"/>
+          <w:i/>
+          <w:iCs/>
+          <w:color w:val="333333"/>
+          <w:sz w:val="22"/>
+          <w:szCs w:val="22"/>
+          <w:rtl/>
+        </w:rPr>
+        <w:t xml:space="preserve">"קיבול של הצעה לאחר שפקעה, כמוהו כהצעה חדשה."</w:t>
+      </w:r>
+    </w:p>
+    <w:p>
+      <w:pPr>
+        <w:keepNext/>
+        <w:bidi/>
+        <w:spacing w:after="20" w:before="0" w:line="276"/>
+      </w:pPr>
+      <w:r>
+        <w:rPr>
+          <w:rFonts w:ascii="Arial" w:cs="Arial" w:eastAsia="Arial" w:hAnsi="Arial"/>
+          <w:b/>
+          <w:bCs/>
+          <w:i w:val="false"/>
+          <w:iCs w:val="false"/>
+          <w:color w:val="2E5395"/>
+          <w:sz w:val="23"/>
+          <w:szCs w:val="23"/>
+          <w:rtl/>
+        </w:rPr>
+        <w:t xml:space="preserve">ס' 10 — חזרה מן הקיבול</w:t>
+      </w:r>
+    </w:p>
+    <w:p>
+      <w:pPr>
+        <w:shd w:fill="F2F2F2" w:val="clear"/>
+        <w:bidi/>
+        <w:spacing w:after="120" w:before="0" w:line="276"/>
+        <w:ind w:left="200" w:right="200"/>
+      </w:pPr>
+      <w:r>
+        <w:rPr>
+          <w:rFonts w:ascii="Arial" w:cs="Arial" w:eastAsia="Arial" w:hAnsi="Arial"/>
+          <w:b w:val="false"/>
+          <w:bCs w:val="false"/>
+          <w:i/>
+          <w:iCs/>
+          <w:color w:val="333333"/>
+          <w:sz w:val="22"/>
+          <w:szCs w:val="22"/>
+          <w:rtl/>
+        </w:rPr>
+        <w:t xml:space="preserve">"הניצע רשאי לחזור בו מן הקיבול בהודעה למציע, ובלבד שהודעת החזרה נמסרה למציע לא לאחר שנמסרה לו הודעת הקיבול או שנודע לו על קיבול בדרך האמורה בסעיף 6(א)."</w:t>
+      </w:r>
+    </w:p>
+    <w:p>
+      <w:pPr>
+        <w:keepNext/>
+        <w:bidi/>
+        <w:spacing w:after="20" w:before="0" w:line="276"/>
+      </w:pPr>
+      <w:r>
+        <w:rPr>
+          <w:rFonts w:ascii="Arial" w:cs="Arial" w:eastAsia="Arial" w:hAnsi="Arial"/>
+          <w:b/>
+          <w:bCs/>
+          <w:i w:val="false"/>
+          <w:iCs w:val="false"/>
+          <w:color w:val="2E5395"/>
+          <w:sz w:val="23"/>
+          <w:szCs w:val="23"/>
+          <w:rtl/>
+        </w:rPr>
+        <w:t xml:space="preserve">ס' 11 — קיבול תוך שינוי</w:t>
+      </w:r>
+    </w:p>
+    <w:p>
+      <w:pPr>
+        <w:shd w:fill="F2F2F2" w:val="clear"/>
+        <w:bidi/>
+        <w:spacing w:after="120" w:before="0" w:line="276"/>
+        <w:ind w:left="200" w:right="200"/>
+      </w:pPr>
+      <w:r>
+        <w:rPr>
+          <w:rFonts w:ascii="Arial" w:cs="Arial" w:eastAsia="Arial" w:hAnsi="Arial"/>
+          <w:b w:val="false"/>
+          <w:bCs w:val="false"/>
+          <w:i/>
+          <w:iCs/>
+          <w:color w:val="333333"/>
+          <w:sz w:val="22"/>
+          <w:szCs w:val="22"/>
+          <w:rtl/>
+        </w:rPr>
+        <w:t xml:space="preserve">"קיבול שיש בו תוספת, הגבלה או שינוי אחר לעומת ההצעה כמוהו כהצעה חדשה."</w:t>
+      </w:r>
+    </w:p>
+    <w:p>
+      <w:pPr>
+        <w:keepNext/>
+        <w:bidi/>
+        <w:spacing w:after="20" w:before="0" w:line="276"/>
+      </w:pPr>
+      <w:r>
+        <w:rPr>
+          <w:rFonts w:ascii="Arial" w:cs="Arial" w:eastAsia="Arial" w:hAnsi="Arial"/>
+          <w:b/>
+          <w:bCs/>
+          <w:i w:val="false"/>
+          <w:iCs w:val="false"/>
+          <w:color w:val="2E5395"/>
+          <w:sz w:val="23"/>
+          <w:szCs w:val="23"/>
+          <w:rtl/>
+        </w:rPr>
+        <w:t xml:space="preserve">ס' 12(א) — תום לב במשא ומתן</w:t>
+      </w:r>
+    </w:p>
+    <w:p>
+      <w:pPr>
+        <w:shd w:fill="F2F2F2" w:val="clear"/>
+        <w:bidi/>
+        <w:spacing w:after="120" w:before="0" w:line="276"/>
+        <w:ind w:left="200" w:right="200"/>
+      </w:pPr>
+      <w:r>
+        <w:rPr>
+          <w:rFonts w:ascii="Arial" w:cs="Arial" w:eastAsia="Arial" w:hAnsi="Arial"/>
+          <w:b w:val="false"/>
+          <w:bCs w:val="false"/>
+          <w:i/>
+          <w:iCs/>
+          <w:color w:val="333333"/>
+          <w:sz w:val="22"/>
+          <w:szCs w:val="22"/>
+          <w:rtl/>
+        </w:rPr>
+        <w:t xml:space="preserve">"במשא ומתן לקראת כריתתו של חוזה חייב אדם לנהוג בדרך מקובלת ובתום לב."</w:t>
+      </w:r>
+    </w:p>
+    <w:p>
+      <w:pPr>
+        <w:keepNext/>
+        <w:bidi/>
+        <w:spacing w:after="20" w:before="0" w:line="276"/>
+      </w:pPr>
+      <w:r>
+        <w:rPr>
+          <w:rFonts w:ascii="Arial" w:cs="Arial" w:eastAsia="Arial" w:hAnsi="Arial"/>
+          <w:b/>
+          <w:bCs/>
+          <w:i w:val="false"/>
+          <w:iCs w:val="false"/>
+          <w:color w:val="2E5395"/>
+          <w:sz w:val="23"/>
+          <w:szCs w:val="23"/>
+          <w:rtl/>
+        </w:rPr>
+        <w:t xml:space="preserve">ס' 12(ב) — הסעד [תמצית]</w:t>
+      </w:r>
+    </w:p>
+    <w:p>
+      <w:pPr>
+        <w:shd w:fill="F2F2F2" w:val="clear"/>
+        <w:bidi/>
+        <w:spacing w:after="120" w:before="0" w:line="276"/>
+        <w:ind w:left="200" w:right="200"/>
+      </w:pPr>
+      <w:r>
+        <w:rPr>
+          <w:rFonts w:ascii="Arial" w:cs="Arial" w:eastAsia="Arial" w:hAnsi="Arial"/>
+          <w:b w:val="false"/>
+          <w:bCs w:val="false"/>
+          <w:i/>
+          <w:iCs/>
+          <w:color w:val="333333"/>
+          <w:sz w:val="22"/>
+          <w:szCs w:val="22"/>
+          <w:rtl/>
+        </w:rPr>
+        <w:t xml:space="preserve">צד שלא נהג בדרך מקובלת ובתום לב חייב לפצות את הצד השני על הנזק שנגרם לו עקב המשא ומתן או עקב כריתת החוזה.</w:t>
+      </w:r>
+    </w:p>
+    <w:p>
+      <w:pPr>
+        <w:bidi/>
+        <w:spacing w:after="120" w:before="0" w:line="276"/>
+      </w:pPr>
+      <w:r>
+        <w:rPr>
+          <w:rFonts w:ascii="Arial" w:cs="Arial" w:eastAsia="Arial" w:hAnsi="Arial"/>
+          <w:b w:val="false"/>
+          <w:bCs w:val="false"/>
+          <w:i w:val="false"/>
+          <w:iCs w:val="false"/>
+          <w:color w:val="666666"/>
+          <w:sz w:val="20"/>
+          <w:szCs w:val="20"/>
+          <w:rtl/>
+        </w:rPr>
+        <w:t xml:space="preserve">בפסיקה: פיצויי הסתמכות (שליליים); בחריג — פיצויי קיום (קל בניין).</w:t>
+      </w:r>
+    </w:p>
+    <w:p>
+      <w:pPr>
+        <w:keepNext/>
+        <w:bidi/>
+        <w:spacing w:after="20" w:before="0" w:line="276"/>
+      </w:pPr>
+      <w:r>
+        <w:rPr>
+          <w:rFonts w:ascii="Arial" w:cs="Arial" w:eastAsia="Arial" w:hAnsi="Arial"/>
+          <w:b/>
+          <w:bCs/>
+          <w:i w:val="false"/>
+          <w:iCs w:val="false"/>
+          <w:color w:val="2E5395"/>
+          <w:sz w:val="23"/>
+          <w:szCs w:val="23"/>
+          <w:rtl/>
+        </w:rPr>
+        <w:t xml:space="preserve">ס' 26 — השלמת פרטים</w:t>
+      </w:r>
+    </w:p>
+    <w:p>
+      <w:pPr>
+        <w:shd w:fill="F2F2F2" w:val="clear"/>
+        <w:bidi/>
+        <w:spacing w:after="120" w:before="0" w:line="276"/>
+        <w:ind w:left="200" w:right="200"/>
+      </w:pPr>
+      <w:r>
+        <w:rPr>
+          <w:rFonts w:ascii="Arial" w:cs="Arial" w:eastAsia="Arial" w:hAnsi="Arial"/>
+          <w:b w:val="false"/>
+          <w:bCs w:val="false"/>
+          <w:i/>
+          <w:iCs/>
+          <w:color w:val="333333"/>
+          <w:sz w:val="22"/>
+          <w:szCs w:val="22"/>
+          <w:rtl/>
+        </w:rPr>
+        <w:t xml:space="preserve">"פרטים שלא נקבעו בחוזה או על פיו יהיו לפי הנוהג הקיים בין הצדדים, ובאין נוהג כזה — לפי הנוהג המקובל בחוזים מאותו סוג, ויראו גם פרטים אלה כמוסכמים."</w:t>
+      </w:r>
+    </w:p>
+    <w:p>
+      <w:pPr>
+        <w:pStyle w:val="Heading2"/>
+        <w:keepNext/>
+        <w:bidi/>
+        <w:spacing w:after="120" w:before="200" w:line="276"/>
+      </w:pPr>
+      <w:r>
+        <w:rPr>
+          <w:rFonts w:ascii="Arial" w:cs="Arial" w:eastAsia="Arial" w:hAnsi="Arial"/>
+          <w:b/>
+          <w:bCs/>
+          <w:i w:val="false"/>
+          <w:iCs w:val="false"/>
+          <w:color w:val="2E5395"/>
+          <w:sz w:val="27"/>
+          <w:szCs w:val="27"/>
+          <w:rtl/>
+        </w:rPr>
+        <w:t xml:space="preserve">פגמים בכריתה</w:t>
+      </w:r>
+    </w:p>
+    <w:p>
+      <w:pPr>
+        <w:keepNext/>
+        <w:bidi/>
+        <w:spacing w:after="20" w:before="0" w:line="276"/>
+      </w:pPr>
+      <w:r>
+        <w:rPr>
+          <w:rFonts w:ascii="Arial" w:cs="Arial" w:eastAsia="Arial" w:hAnsi="Arial"/>
+          <w:b/>
+          <w:bCs/>
+          <w:i w:val="false"/>
+          <w:iCs w:val="false"/>
+          <w:color w:val="2E5395"/>
+          <w:sz w:val="23"/>
+          <w:szCs w:val="23"/>
+          <w:rtl/>
+        </w:rPr>
+        <w:t xml:space="preserve">ס' 14(א) — טעות ידועה</w:t>
+      </w:r>
+    </w:p>
+    <w:p>
+      <w:pPr>
+        <w:shd w:fill="F2F2F2" w:val="clear"/>
+        <w:bidi/>
+        <w:spacing w:after="120" w:before="0" w:line="276"/>
+        <w:ind w:left="200" w:right="200"/>
+      </w:pPr>
+      <w:r>
+        <w:rPr>
+          <w:rFonts w:ascii="Arial" w:cs="Arial" w:eastAsia="Arial" w:hAnsi="Arial"/>
+          <w:b w:val="false"/>
+          <w:bCs w:val="false"/>
+          <w:i/>
+          <w:iCs/>
+          <w:color w:val="333333"/>
+          <w:sz w:val="22"/>
+          <w:szCs w:val="22"/>
+          <w:rtl/>
+        </w:rPr>
+        <w:t xml:space="preserve">"מי שהתקשר בחוזה עקב טעות וניתן להניח שלולא הטעות לא היה מתקשר בחוזה והצד השני ידע או היה עליו לדעת על כך, רשאי לבטל את החוזה."</w:t>
+      </w:r>
+    </w:p>
+    <w:p>
+      <w:pPr>
+        <w:keepNext/>
+        <w:bidi/>
+        <w:spacing w:after="20" w:before="0" w:line="276"/>
+      </w:pPr>
+      <w:r>
+        <w:rPr>
+          <w:rFonts w:ascii="Arial" w:cs="Arial" w:eastAsia="Arial" w:hAnsi="Arial"/>
+          <w:b/>
+          <w:bCs/>
+          <w:i w:val="false"/>
+          <w:iCs w:val="false"/>
+          <w:color w:val="2E5395"/>
+          <w:sz w:val="23"/>
+          <w:szCs w:val="23"/>
+          <w:rtl/>
+        </w:rPr>
+        <w:t xml:space="preserve">ס' 14(ב) — טעות שאינה ידועה</w:t>
+      </w:r>
+    </w:p>
+    <w:p>
+      <w:pPr>
+        <w:shd w:fill="F2F2F2" w:val="clear"/>
+        <w:bidi/>
+        <w:spacing w:after="120" w:before="0" w:line="276"/>
+        <w:ind w:left="200" w:right="200"/>
+      </w:pPr>
+      <w:r>
+        <w:rPr>
+          <w:rFonts w:ascii="Arial" w:cs="Arial" w:eastAsia="Arial" w:hAnsi="Arial"/>
+          <w:b w:val="false"/>
+          <w:bCs w:val="false"/>
+          <w:i/>
+          <w:iCs/>
+          <w:color w:val="333333"/>
+          <w:sz w:val="22"/>
+          <w:szCs w:val="22"/>
+          <w:rtl/>
+        </w:rPr>
+        <w:t xml:space="preserve">"מי שהתקשר בחוזה עקב טעות וניתן להניח שלולא הטעות לא היה מתקשר בחוזה והצד השני לא ידע ולא היה עליו לדעת על כך, רשאי בית המשפט, לפי בקשת הצד שטעה, לבטל את החוזה, אם ראה שמן הצדק לעשות זאת; עשה כן, רשאי בית המשפט לחייב את הצד שטעה בפיצויים בעד הנזק שנגרם לצד השני עקב כריתת החוזה."</w:t>
+      </w:r>
+    </w:p>
+    <w:p>
+      <w:pPr>
+        <w:keepNext/>
+        <w:bidi/>
+        <w:spacing w:after="20" w:before="0" w:line="276"/>
+      </w:pPr>
+      <w:r>
+        <w:rPr>
+          <w:rFonts w:ascii="Arial" w:cs="Arial" w:eastAsia="Arial" w:hAnsi="Arial"/>
+          <w:b/>
+          <w:bCs/>
+          <w:i w:val="false"/>
+          <w:iCs w:val="false"/>
+          <w:color w:val="2E5395"/>
+          <w:sz w:val="23"/>
+          <w:szCs w:val="23"/>
+          <w:rtl/>
+        </w:rPr>
+        <w:t xml:space="preserve">ס' 14(ג) — תיקון הטעות</w:t>
+      </w:r>
+    </w:p>
+    <w:p>
+      <w:pPr>
+        <w:shd w:fill="F2F2F2" w:val="clear"/>
+        <w:bidi/>
+        <w:spacing w:after="120" w:before="0" w:line="276"/>
+        <w:ind w:left="200" w:right="200"/>
+      </w:pPr>
+      <w:r>
+        <w:rPr>
+          <w:rFonts w:ascii="Arial" w:cs="Arial" w:eastAsia="Arial" w:hAnsi="Arial"/>
+          <w:b w:val="false"/>
+          <w:bCs w:val="false"/>
+          <w:i/>
+          <w:iCs/>
+          <w:color w:val="333333"/>
+          <w:sz w:val="22"/>
+          <w:szCs w:val="22"/>
+          <w:rtl/>
+        </w:rPr>
+        <w:t xml:space="preserve">"טעות אינה עילה לביטול חוזה, אם ניתן לקיים את החוזה בתיקון הטעות והצד השני הודיע, לפני שבוטל החוזה, שהוא מוכן לעשות כן."</w:t>
+      </w:r>
+    </w:p>
+    <w:p>
+      <w:pPr>
+        <w:keepNext/>
+        <w:bidi/>
+        <w:spacing w:after="20" w:before="0" w:line="276"/>
+      </w:pPr>
+      <w:r>
+        <w:rPr>
+          <w:rFonts w:ascii="Arial" w:cs="Arial" w:eastAsia="Arial" w:hAnsi="Arial"/>
+          <w:b/>
+          <w:bCs/>
+          <w:i w:val="false"/>
+          <w:iCs w:val="false"/>
+          <w:color w:val="2E5395"/>
+          <w:sz w:val="23"/>
+          <w:szCs w:val="23"/>
+          <w:rtl/>
+        </w:rPr>
+        <w:t xml:space="preserve">ס' 14(ד) — הגדרת "טעות" [תמצית]</w:t>
+      </w:r>
+    </w:p>
+    <w:p>
+      <w:pPr>
+        <w:shd w:fill="F2F2F2" w:val="clear"/>
+        <w:bidi/>
+        <w:spacing w:after="120" w:before="0" w:line="276"/>
+        <w:ind w:left="200" w:right="200"/>
+      </w:pPr>
+      <w:r>
+        <w:rPr>
+          <w:rFonts w:ascii="Arial" w:cs="Arial" w:eastAsia="Arial" w:hAnsi="Arial"/>
+          <w:b w:val="false"/>
+          <w:bCs w:val="false"/>
+          <w:i/>
+          <w:iCs/>
+          <w:color w:val="333333"/>
+          <w:sz w:val="22"/>
+          <w:szCs w:val="22"/>
+          <w:rtl/>
+        </w:rPr>
+        <w:t xml:space="preserve">"טעות" לעניין סעיף זה וסעיף 15 — בין בעובדה ובין בחוק, להוציא טעות שאינה אלא בכדאיות העסקה.</w:t>
+      </w:r>
+    </w:p>
+    <w:p>
+      <w:pPr>
+        <w:bidi/>
+        <w:spacing w:after="120" w:before="0" w:line="276"/>
+      </w:pPr>
+      <w:r>
+        <w:rPr>
+          <w:rFonts w:ascii="Arial" w:cs="Arial" w:eastAsia="Arial" w:hAnsi="Arial"/>
+          <w:b w:val="false"/>
+          <w:bCs w:val="false"/>
+          <w:i w:val="false"/>
+          <w:iCs w:val="false"/>
+          <w:color w:val="666666"/>
+          <w:sz w:val="20"/>
+          <w:szCs w:val="20"/>
+          <w:rtl/>
+        </w:rPr>
+        <w:t xml:space="preserve">זהו הסייג המרכזי: סיכון שנטל צד במפורש או מכללא והתממש — אינו טעות.</w:t>
+      </w:r>
+    </w:p>
+    <w:p>
+      <w:pPr>
+        <w:keepNext/>
+        <w:bidi/>
+        <w:spacing w:after="20" w:before="0" w:line="276"/>
+      </w:pPr>
+      <w:r>
+        <w:rPr>
+          <w:rFonts w:ascii="Arial" w:cs="Arial" w:eastAsia="Arial" w:hAnsi="Arial"/>
+          <w:b/>
+          <w:bCs/>
+          <w:i w:val="false"/>
+          <w:iCs w:val="false"/>
+          <w:color w:val="2E5395"/>
+          <w:sz w:val="23"/>
+          <w:szCs w:val="23"/>
+          <w:rtl/>
+        </w:rPr>
+        <w:t xml:space="preserve">ס' 15 — הטעיה [צפוי להילמד ב-1.9]</w:t>
+      </w:r>
+    </w:p>
+    <w:p>
+      <w:pPr>
+        <w:shd w:fill="F2F2F2" w:val="clear"/>
+        <w:bidi/>
+        <w:spacing w:after="120" w:before="0" w:line="276"/>
+        <w:ind w:left="200" w:right="200"/>
+      </w:pPr>
+      <w:r>
+        <w:rPr>
+          <w:rFonts w:ascii="Arial" w:cs="Arial" w:eastAsia="Arial" w:hAnsi="Arial"/>
+          <w:b w:val="false"/>
+          <w:bCs w:val="false"/>
+          <w:i/>
+          <w:iCs/>
+          <w:color w:val="333333"/>
+          <w:sz w:val="22"/>
+          <w:szCs w:val="22"/>
+          <w:rtl/>
+        </w:rPr>
+        <w:t xml:space="preserve">"מי שהתקשר בחוזה עקב טעות שהיא תוצאת הטעיה שהטעהו הצד השני או אחר מטעמו, רשאי לבטל את החוזה; לענין זה, 'הטעיה' — לרבות אי-גילוין של עובדות אשר לפי דין, לפי נוהג או לפי הנסיבות היה על הצד השני לגלותן."</w:t>
+      </w:r>
+    </w:p>
+    <w:p>
+      <w:pPr>
+        <w:keepNext/>
+        <w:bidi/>
+        <w:spacing w:after="20" w:before="0" w:line="276"/>
+      </w:pPr>
+      <w:r>
+        <w:rPr>
+          <w:rFonts w:ascii="Arial" w:cs="Arial" w:eastAsia="Arial" w:hAnsi="Arial"/>
+          <w:b/>
+          <w:bCs/>
+          <w:i w:val="false"/>
+          <w:iCs w:val="false"/>
+          <w:color w:val="2E5395"/>
+          <w:sz w:val="23"/>
+          <w:szCs w:val="23"/>
+          <w:rtl/>
+        </w:rPr>
+        <w:t xml:space="preserve">ס' 19 — ביטול חלקי</w:t>
+      </w:r>
+    </w:p>
+    <w:p>
+      <w:pPr>
+        <w:shd w:fill="F2F2F2" w:val="clear"/>
+        <w:bidi/>
+        <w:spacing w:after="120" w:before="0" w:line="276"/>
+        <w:ind w:left="200" w:right="200"/>
+      </w:pPr>
+      <w:r>
+        <w:rPr>
+          <w:rFonts w:ascii="Arial" w:cs="Arial" w:eastAsia="Arial" w:hAnsi="Arial"/>
+          <w:b w:val="false"/>
+          <w:bCs w:val="false"/>
+          <w:i/>
+          <w:iCs/>
+          <w:color w:val="333333"/>
+          <w:sz w:val="22"/>
+          <w:szCs w:val="22"/>
+          <w:rtl/>
+        </w:rPr>
+        <w:t xml:space="preserve">"ניתן החוזה להפרדה לחלקים ועילת הביטול נוגעת רק לאחד מחלקיו, ניתן לביטול אותו חלק בלבד; אולם אם יש להניח שהצד הרשאי לבטל לא היה מתקשר בחוזה לולא העילה, רשאי הוא לבטל את החלק האמור או את החוזה כולו."</w:t>
+      </w:r>
+    </w:p>
+    <w:p>
+      <w:pPr>
+        <w:keepNext/>
+        <w:bidi/>
+        <w:spacing w:after="20" w:before="0" w:line="276"/>
+      </w:pPr>
+      <w:r>
+        <w:rPr>
+          <w:rFonts w:ascii="Arial" w:cs="Arial" w:eastAsia="Arial" w:hAnsi="Arial"/>
+          <w:b/>
+          <w:bCs/>
+          <w:i w:val="false"/>
+          <w:iCs w:val="false"/>
+          <w:color w:val="2E5395"/>
+          <w:sz w:val="23"/>
+          <w:szCs w:val="23"/>
+          <w:rtl/>
+        </w:rPr>
+        <w:t xml:space="preserve">ס' 20 — דרך הביטול [תמצית]</w:t>
+      </w:r>
+    </w:p>
+    <w:p>
+      <w:pPr>
+        <w:shd w:fill="F2F2F2" w:val="clear"/>
+        <w:bidi/>
+        <w:spacing w:after="120" w:before="0" w:line="276"/>
+        <w:ind w:left="200" w:right="200"/>
+      </w:pPr>
+      <w:r>
+        <w:rPr>
+          <w:rFonts w:ascii="Arial" w:cs="Arial" w:eastAsia="Arial" w:hAnsi="Arial"/>
+          <w:b w:val="false"/>
+          <w:bCs w:val="false"/>
+          <w:i/>
+          <w:iCs/>
+          <w:color w:val="333333"/>
+          <w:sz w:val="22"/>
+          <w:szCs w:val="22"/>
+          <w:rtl/>
+        </w:rPr>
+        <w:t xml:space="preserve">ביטול החוזה יהיה בהודעת המתקשר לצד השני תוך זמן סביר לאחר שנודע לו על עילת הביטול, ובמקרה של כפייה — תוך זמן סביר לאחר שנודע לו שפסקה הכפייה.</w:t>
+      </w:r>
+    </w:p>
+    <w:p>
+      <w:pPr>
+        <w:bidi/>
+        <w:spacing w:after="120" w:before="0" w:line="276"/>
+      </w:pPr>
+      <w:r>
+        <w:rPr>
+          <w:rFonts w:ascii="Arial" w:cs="Arial" w:eastAsia="Arial" w:hAnsi="Arial"/>
+          <w:b w:val="false"/>
+          <w:bCs w:val="false"/>
+          <w:i w:val="false"/>
+          <w:iCs w:val="false"/>
+          <w:color w:val="666666"/>
+          <w:sz w:val="20"/>
+          <w:szCs w:val="20"/>
+          <w:rtl/>
+        </w:rPr>
+        <w:t xml:space="preserve">ההודעה יכולה להיות אף משתמעת (מהמצגת).</w:t>
+      </w:r>
+    </w:p>
+    <w:p>
+      <w:pPr>
+        <w:keepNext/>
+        <w:bidi/>
+        <w:spacing w:after="20" w:before="0" w:line="276"/>
+      </w:pPr>
+      <w:r>
+        <w:rPr>
+          <w:rFonts w:ascii="Arial" w:cs="Arial" w:eastAsia="Arial" w:hAnsi="Arial"/>
+          <w:b/>
+          <w:bCs/>
+          <w:i w:val="false"/>
+          <w:iCs w:val="false"/>
+          <w:color w:val="2E5395"/>
+          <w:sz w:val="23"/>
+          <w:szCs w:val="23"/>
+          <w:rtl/>
+        </w:rPr>
+        <w:t xml:space="preserve">ס' 21 — השבה [תמצית]</w:t>
+      </w:r>
+    </w:p>
+    <w:p>
+      <w:pPr>
+        <w:shd w:fill="F2F2F2" w:val="clear"/>
+        <w:bidi/>
+        <w:spacing w:after="120" w:before="0" w:line="276"/>
+        <w:ind w:left="200" w:right="200"/>
+      </w:pPr>
+      <w:r>
+        <w:rPr>
+          <w:rFonts w:ascii="Arial" w:cs="Arial" w:eastAsia="Arial" w:hAnsi="Arial"/>
+          <w:b w:val="false"/>
+          <w:bCs w:val="false"/>
+          <w:i/>
+          <w:iCs/>
+          <w:color w:val="333333"/>
+          <w:sz w:val="22"/>
+          <w:szCs w:val="22"/>
+          <w:rtl/>
+        </w:rPr>
+        <w:t xml:space="preserve">משבוטל החוזה, חייב כל צד להשיב לצד השני מה שקיבל על פי החוזה, ואם ההשבה היתה בלתי אפשרית או בלתי סבירה — לשלם לו את שוויו של מה שקיבל.</w:t>
+      </w:r>
+    </w:p>
+    <w:p>
+      <w:pPr>
+        <w:keepNext/>
+        <w:bidi/>
+        <w:spacing w:after="20" w:before="0" w:line="276"/>
+      </w:pPr>
+      <w:r>
+        <w:rPr>
+          <w:rFonts w:ascii="Arial" w:cs="Arial" w:eastAsia="Arial" w:hAnsi="Arial"/>
+          <w:b/>
+          <w:bCs/>
+          <w:i w:val="false"/>
+          <w:iCs w:val="false"/>
+          <w:color w:val="2E5395"/>
+          <w:sz w:val="23"/>
+          <w:szCs w:val="23"/>
+          <w:rtl/>
+        </w:rPr>
+        <w:t xml:space="preserve">ס' 22 — שמירת תרופות [תמצית]</w:t>
+      </w:r>
+    </w:p>
+    <w:p>
+      <w:pPr>
+        <w:shd w:fill="F2F2F2" w:val="clear"/>
+        <w:bidi/>
+        <w:spacing w:after="120" w:before="0" w:line="276"/>
+        <w:ind w:left="200" w:right="200"/>
+      </w:pPr>
+      <w:r>
+        <w:rPr>
+          <w:rFonts w:ascii="Arial" w:cs="Arial" w:eastAsia="Arial" w:hAnsi="Arial"/>
+          <w:b w:val="false"/>
+          <w:bCs w:val="false"/>
+          <w:i/>
+          <w:iCs/>
+          <w:color w:val="333333"/>
+          <w:sz w:val="22"/>
+          <w:szCs w:val="22"/>
+          <w:rtl/>
+        </w:rPr>
+        <w:t xml:space="preserve">אין בהוראות פרק זה כדי לגרוע מהוראות כל דין בדבר תרופות אחרות.</w:t>
+      </w:r>
+    </w:p>
+    <w:p>
+      <w:pPr>
+        <w:bidi/>
+        <w:spacing w:after="120" w:before="0" w:line="276"/>
+      </w:pPr>
+      <w:r>
+        <w:rPr>
+          <w:rFonts w:ascii="Arial" w:cs="Arial" w:eastAsia="Arial" w:hAnsi="Arial"/>
+          <w:b w:val="false"/>
+          <w:bCs w:val="false"/>
+          <w:i w:val="false"/>
+          <w:iCs w:val="false"/>
+          <w:color w:val="666666"/>
+          <w:sz w:val="20"/>
+          <w:szCs w:val="20"/>
+          <w:rtl/>
+        </w:rPr>
+        <w:t xml:space="preserve">המשמעות המעשית: אפשר לצרף פיצויי ס' 12 לביטול ולהשבה.</w:t>
+      </w:r>
+    </w:p>
+    <w:p>
+      <w:pPr>
+        <w:pStyle w:val="Heading2"/>
+        <w:keepNext/>
+        <w:bidi/>
+        <w:spacing w:after="120" w:before="200" w:line="276"/>
+      </w:pPr>
+      <w:r>
+        <w:rPr>
+          <w:rFonts w:ascii="Arial" w:cs="Arial" w:eastAsia="Arial" w:hAnsi="Arial"/>
+          <w:b/>
+          <w:bCs/>
+          <w:i w:val="false"/>
+          <w:iCs w:val="false"/>
+          <w:color w:val="2E5395"/>
+          <w:sz w:val="27"/>
+          <w:szCs w:val="27"/>
+          <w:rtl/>
+        </w:rPr>
+        <w:t xml:space="preserve">עקרונות ומסגרת</w:t>
+      </w:r>
+    </w:p>
+    <w:p>
+      <w:pPr>
+        <w:keepNext/>
+        <w:bidi/>
+        <w:spacing w:after="20" w:before="0" w:line="276"/>
+      </w:pPr>
+      <w:r>
+        <w:rPr>
+          <w:rFonts w:ascii="Arial" w:cs="Arial" w:eastAsia="Arial" w:hAnsi="Arial"/>
+          <w:b/>
+          <w:bCs/>
+          <w:i w:val="false"/>
+          <w:iCs w:val="false"/>
+          <w:color w:val="2E5395"/>
+          <w:sz w:val="23"/>
+          <w:szCs w:val="23"/>
+          <w:rtl/>
+        </w:rPr>
+        <w:t xml:space="preserve">ס' 23 — צורת החוזה</w:t>
+      </w:r>
+    </w:p>
+    <w:p>
+      <w:pPr>
+        <w:shd w:fill="F2F2F2" w:val="clear"/>
+        <w:bidi/>
+        <w:spacing w:after="120" w:before="0" w:line="276"/>
+        <w:ind w:left="200" w:right="200"/>
+      </w:pPr>
+      <w:r>
+        <w:rPr>
+          <w:rFonts w:ascii="Arial" w:cs="Arial" w:eastAsia="Arial" w:hAnsi="Arial"/>
+          <w:b w:val="false"/>
+          <w:bCs w:val="false"/>
+          <w:i/>
+          <w:iCs/>
+          <w:color w:val="333333"/>
+          <w:sz w:val="22"/>
+          <w:szCs w:val="22"/>
+          <w:rtl/>
+        </w:rPr>
+        <w:t xml:space="preserve">"חוזה יכול שייעשה בעל פה, בכתב או בצורה אחרת, זולת אם היתה צורה מסויימת תנאי לתקפו על פי חוק או הסכם בין הצדדים."</w:t>
+      </w:r>
+    </w:p>
+    <w:p>
+      <w:pPr>
+        <w:keepNext/>
+        <w:bidi/>
+        <w:spacing w:after="20" w:before="0" w:line="276"/>
+      </w:pPr>
+      <w:r>
+        <w:rPr>
+          <w:rFonts w:ascii="Arial" w:cs="Arial" w:eastAsia="Arial" w:hAnsi="Arial"/>
+          <w:b/>
+          <w:bCs/>
+          <w:i w:val="false"/>
+          <w:iCs w:val="false"/>
+          <w:color w:val="2E5395"/>
+          <w:sz w:val="23"/>
+          <w:szCs w:val="23"/>
+          <w:rtl/>
+        </w:rPr>
+        <w:t xml:space="preserve">ס' 30 — חוזה פסול</w:t>
+      </w:r>
+    </w:p>
+    <w:p>
+      <w:pPr>
+        <w:shd w:fill="F2F2F2" w:val="clear"/>
+        <w:bidi/>
+        <w:spacing w:after="120" w:before="0" w:line="276"/>
+        <w:ind w:left="200" w:right="200"/>
+      </w:pPr>
+      <w:r>
+        <w:rPr>
+          <w:rFonts w:ascii="Arial" w:cs="Arial" w:eastAsia="Arial" w:hAnsi="Arial"/>
+          <w:b w:val="false"/>
+          <w:bCs w:val="false"/>
+          <w:i/>
+          <w:iCs/>
+          <w:color w:val="333333"/>
+          <w:sz w:val="22"/>
+          <w:szCs w:val="22"/>
+          <w:rtl/>
+        </w:rPr>
+        <w:t xml:space="preserve">"חוזה שכריתתו, תכנו או מטרתו הם בלתי חוקיים, בלתי מוסריים או סותרים את תקנת הציבור — בטל."</w:t>
+      </w:r>
+    </w:p>
+    <w:p>
+      <w:pPr>
+        <w:keepNext/>
+        <w:bidi/>
+        <w:spacing w:after="20" w:before="0" w:line="276"/>
+      </w:pPr>
+      <w:r>
+        <w:rPr>
+          <w:rFonts w:ascii="Arial" w:cs="Arial" w:eastAsia="Arial" w:hAnsi="Arial"/>
+          <w:b/>
+          <w:bCs/>
+          <w:i w:val="false"/>
+          <w:iCs w:val="false"/>
+          <w:color w:val="2E5395"/>
+          <w:sz w:val="23"/>
+          <w:szCs w:val="23"/>
+          <w:rtl/>
+        </w:rPr>
+        <w:t xml:space="preserve">חוק הכשרות המשפטית, ס' 2 — כשרות</w:t>
+      </w:r>
+    </w:p>
+    <w:p>
+      <w:pPr>
+        <w:shd w:fill="F2F2F2" w:val="clear"/>
+        <w:bidi/>
+        <w:spacing w:after="120" w:before="0" w:line="276"/>
+        <w:ind w:left="200" w:right="200"/>
+      </w:pPr>
+      <w:r>
+        <w:rPr>
+          <w:rFonts w:ascii="Arial" w:cs="Arial" w:eastAsia="Arial" w:hAnsi="Arial"/>
+          <w:b w:val="false"/>
+          <w:bCs w:val="false"/>
+          <w:i/>
+          <w:iCs/>
+          <w:color w:val="333333"/>
+          <w:sz w:val="22"/>
+          <w:szCs w:val="22"/>
+          <w:rtl/>
+        </w:rPr>
+        <w:t xml:space="preserve">"כל אדם כשר לפעולות משפטיות, זולת אם נשללה או הוגבלה כשרות זו בחוק או בפסק דין של בית משפט."</w:t>
+      </w:r>
+    </w:p>
+    <w:p>
+      <w:pPr>
+        <w:keepNext/>
+        <w:bidi/>
+        <w:spacing w:after="20" w:before="0" w:line="276"/>
+      </w:pPr>
+      <w:r>
+        <w:rPr>
+          <w:rFonts w:ascii="Arial" w:cs="Arial" w:eastAsia="Arial" w:hAnsi="Arial"/>
+          <w:b/>
+          <w:bCs/>
+          <w:i w:val="false"/>
+          <w:iCs w:val="false"/>
+          <w:color w:val="2E5395"/>
+          <w:sz w:val="23"/>
+          <w:szCs w:val="23"/>
+          <w:rtl/>
+        </w:rPr>
+        <w:t xml:space="preserve">שם, ס' 3 — קטינות ובגירות</w:t>
+      </w:r>
+    </w:p>
+    <w:p>
+      <w:pPr>
+        <w:shd w:fill="F2F2F2" w:val="clear"/>
+        <w:bidi/>
+        <w:spacing w:after="120" w:before="0" w:line="276"/>
+        <w:ind w:left="200" w:right="200"/>
+      </w:pPr>
+      <w:r>
+        <w:rPr>
+          <w:rFonts w:ascii="Arial" w:cs="Arial" w:eastAsia="Arial" w:hAnsi="Arial"/>
+          <w:b w:val="false"/>
+          <w:bCs w:val="false"/>
+          <w:i/>
+          <w:iCs/>
+          <w:color w:val="333333"/>
+          <w:sz w:val="22"/>
+          <w:szCs w:val="22"/>
+          <w:rtl/>
+        </w:rPr>
+        <w:t xml:space="preserve">"אדם שלא מלאו לו 18 שנה הוא קטין; אדם שמלאו לו 18 שנה הוא בגיר."</w:t>
+      </w:r>
+    </w:p>
+    <w:p>
+      <w:pPr>
+        <w:keepNext/>
+        <w:bidi/>
+        <w:spacing w:after="20" w:before="0" w:line="276"/>
+      </w:pPr>
+      <w:r>
+        <w:rPr>
+          <w:rFonts w:ascii="Arial" w:cs="Arial" w:eastAsia="Arial" w:hAnsi="Arial"/>
+          <w:b/>
+          <w:bCs/>
+          <w:i w:val="false"/>
+          <w:iCs w:val="false"/>
+          <w:color w:val="2E5395"/>
+          <w:sz w:val="23"/>
+          <w:szCs w:val="23"/>
+          <w:rtl/>
+        </w:rPr>
+        <w:t xml:space="preserve">שם, ס' 4 — פעולות של קטין</w:t>
+      </w:r>
+    </w:p>
+    <w:p>
+      <w:pPr>
+        <w:shd w:fill="F2F2F2" w:val="clear"/>
+        <w:bidi/>
+        <w:spacing w:after="120" w:before="0" w:line="276"/>
+        <w:ind w:left="200" w:right="200"/>
+      </w:pPr>
+      <w:r>
+        <w:rPr>
+          <w:rFonts w:ascii="Arial" w:cs="Arial" w:eastAsia="Arial" w:hAnsi="Arial"/>
+          <w:b w:val="false"/>
+          <w:bCs w:val="false"/>
+          <w:i/>
+          <w:iCs/>
+          <w:color w:val="333333"/>
+          <w:sz w:val="22"/>
+          <w:szCs w:val="22"/>
+          <w:rtl/>
+        </w:rPr>
+        <w:t xml:space="preserve">"פעולה משפטית של קטין טעונה הסכמת נציגו; ההסכמה יכולה להינתן מראש או למפרע לפעולה מסויימת או לסוג מסויים של פעולות."</w:t>
+      </w:r>
+    </w:p>
+    <w:p>
+      <w:pPr>
+        <w:pStyle w:val="Heading2"/>
+        <w:keepNext/>
+        <w:bidi/>
+        <w:spacing w:after="120" w:before="200" w:line="276"/>
+      </w:pPr>
+      <w:r>
+        <w:rPr>
+          <w:rFonts w:ascii="Arial" w:cs="Arial" w:eastAsia="Arial" w:hAnsi="Arial"/>
+          <w:b/>
+          <w:bCs/>
+          <w:i w:val="false"/>
+          <w:iCs w:val="false"/>
+          <w:color w:val="2E5395"/>
+          <w:sz w:val="27"/>
+          <w:szCs w:val="27"/>
+          <w:rtl/>
+        </w:rPr>
+        <w:t xml:space="preserve">סעיפי הכפייה והעושק (נספח — טרם נלמד)</w:t>
+      </w:r>
+    </w:p>
+    <w:p>
+      <w:pPr>
+        <w:keepNext/>
+        <w:bidi/>
+        <w:spacing w:after="20" w:before="0" w:line="276"/>
+      </w:pPr>
+      <w:r>
+        <w:rPr>
+          <w:rFonts w:ascii="Arial" w:cs="Arial" w:eastAsia="Arial" w:hAnsi="Arial"/>
+          <w:b/>
+          <w:bCs/>
+          <w:i w:val="false"/>
+          <w:iCs w:val="false"/>
+          <w:color w:val="2E5395"/>
+          <w:sz w:val="23"/>
+          <w:szCs w:val="23"/>
+          <w:rtl/>
+        </w:rPr>
+        <w:t xml:space="preserve">ס' 17(א) — כפייה</w:t>
+      </w:r>
+    </w:p>
+    <w:p>
+      <w:pPr>
+        <w:shd w:fill="F2F2F2" w:val="clear"/>
+        <w:bidi/>
+        <w:spacing w:after="120" w:before="0" w:line="276"/>
+        <w:ind w:left="200" w:right="200"/>
+      </w:pPr>
+      <w:r>
+        <w:rPr>
+          <w:rFonts w:ascii="Arial" w:cs="Arial" w:eastAsia="Arial" w:hAnsi="Arial"/>
+          <w:b w:val="false"/>
+          <w:bCs w:val="false"/>
+          <w:i/>
+          <w:iCs/>
+          <w:color w:val="333333"/>
+          <w:sz w:val="22"/>
+          <w:szCs w:val="22"/>
+          <w:rtl/>
+        </w:rPr>
+        <w:t xml:space="preserve">"מי שהתקשר בחוזה עקב כפיה שכפה עליו הצד השני או אחד מטעמו, בכוח או באיום, רשאי לבטל את החוזה."</w:t>
+      </w:r>
+    </w:p>
+    <w:p>
+      <w:pPr>
+        <w:keepNext/>
+        <w:bidi/>
+        <w:spacing w:after="20" w:before="0" w:line="276"/>
+      </w:pPr>
+      <w:r>
+        <w:rPr>
+          <w:rFonts w:ascii="Arial" w:cs="Arial" w:eastAsia="Arial" w:hAnsi="Arial"/>
+          <w:b/>
+          <w:bCs/>
+          <w:i w:val="false"/>
+          <w:iCs w:val="false"/>
+          <w:color w:val="2E5395"/>
+          <w:sz w:val="23"/>
+          <w:szCs w:val="23"/>
+          <w:rtl/>
+        </w:rPr>
+        <w:t xml:space="preserve">ס' 17(ב) — אזהרה בתום לב</w:t>
+      </w:r>
+    </w:p>
+    <w:p>
+      <w:pPr>
+        <w:shd w:fill="F2F2F2" w:val="clear"/>
+        <w:bidi/>
+        <w:spacing w:after="120" w:before="0" w:line="276"/>
+        <w:ind w:left="200" w:right="200"/>
+      </w:pPr>
+      <w:r>
+        <w:rPr>
+          <w:rFonts w:ascii="Arial" w:cs="Arial" w:eastAsia="Arial" w:hAnsi="Arial"/>
+          <w:b w:val="false"/>
+          <w:bCs w:val="false"/>
+          <w:i/>
+          <w:iCs/>
+          <w:color w:val="333333"/>
+          <w:sz w:val="22"/>
+          <w:szCs w:val="22"/>
+          <w:rtl/>
+        </w:rPr>
+        <w:t xml:space="preserve">"אזהרה בתום-לב על הפעלתה של זכות אינה בגדר איום לעניין סעיף זה."</w:t>
+      </w:r>
+    </w:p>
+    <w:p>
+      <w:pPr>
+        <w:keepNext/>
+        <w:bidi/>
+        <w:spacing w:after="20" w:before="0" w:line="276"/>
+      </w:pPr>
+      <w:r>
+        <w:rPr>
+          <w:rFonts w:ascii="Arial" w:cs="Arial" w:eastAsia="Arial" w:hAnsi="Arial"/>
+          <w:b/>
+          <w:bCs/>
+          <w:i w:val="false"/>
+          <w:iCs w:val="false"/>
+          <w:color w:val="2E5395"/>
+          <w:sz w:val="23"/>
+          <w:szCs w:val="23"/>
+          <w:rtl/>
+        </w:rPr>
+        <w:t xml:space="preserve">ס' 18 — עושק</w:t>
+      </w:r>
+    </w:p>
+    <w:p>
+      <w:pPr>
+        <w:shd w:fill="F2F2F2" w:val="clear"/>
+        <w:bidi/>
+        <w:spacing w:after="120" w:before="0" w:line="276"/>
+        <w:ind w:left="200" w:right="200"/>
+      </w:pPr>
+      <w:r>
+        <w:rPr>
+          <w:rFonts w:ascii="Arial" w:cs="Arial" w:eastAsia="Arial" w:hAnsi="Arial"/>
+          <w:b w:val="false"/>
+          <w:bCs w:val="false"/>
+          <w:i/>
+          <w:iCs/>
+          <w:color w:val="333333"/>
+          <w:sz w:val="22"/>
+          <w:szCs w:val="22"/>
+          <w:rtl/>
+        </w:rPr>
+        <w:t xml:space="preserve">"מי שהתקשר בחוזה עקב ניצול הצד השני או אחר מטעמו את מצוקת המתקשר, חולשתו השכלית או הגופנית או חוסר נסיונו, ותנאי החוזה גרועים במידה בלתי סבירה מן המקובל, רשאי לבטל את החוזה."</w:t>
+      </w:r>
+    </w:p>
+    <w:p>
+      <w:pPr>
+        <w:keepNext/>
+        <w:bidi/>
+        <w:spacing w:after="20" w:before="0" w:line="276"/>
+      </w:pPr>
+      <w:r>
+        <w:rPr>
+          <w:rFonts w:ascii="Arial" w:cs="Arial" w:eastAsia="Arial" w:hAnsi="Arial"/>
+          <w:b/>
+          <w:bCs/>
+          <w:i w:val="false"/>
+          <w:iCs w:val="false"/>
+          <w:color w:val="2E5395"/>
+          <w:sz w:val="23"/>
+          <w:szCs w:val="23"/>
+          <w:rtl/>
+        </w:rPr>
+        <w:t xml:space="preserve">ס' 16 — טעות סופר [תמצית]</w:t>
+      </w:r>
+    </w:p>
+    <w:p>
+      <w:pPr>
+        <w:shd w:fill="F2F2F2" w:val="clear"/>
+        <w:bidi/>
+        <w:spacing w:after="120" w:before="0" w:line="276"/>
+        <w:ind w:left="200" w:right="200"/>
+      </w:pPr>
+      <w:r>
+        <w:rPr>
+          <w:rFonts w:ascii="Arial" w:cs="Arial" w:eastAsia="Arial" w:hAnsi="Arial"/>
+          <w:b w:val="false"/>
+          <w:bCs w:val="false"/>
+          <w:i/>
+          <w:iCs/>
+          <w:color w:val="333333"/>
+          <w:sz w:val="22"/>
+          <w:szCs w:val="22"/>
+          <w:rtl/>
+        </w:rPr>
+        <w:t xml:space="preserve">נפלה בחוזה טעות סופר או טעות כיוצא בה, יתוקן החוזה לפי אומד דעת הצדדים ואין הטעות עילה לביטול החוזה.</w:t>
       </w:r>
     </w:p>
     <w:p>

</xml_diff>

<commit_message>
Add s.60 (giving notice) — verified gap against the course slides
Cross-checked the booklet against every official course file on Moodle
(intro, presentation 1, presentation 2, Kozli, review slides 1-3, the two
case decks). Every case in the "from the official slides" table is
confirmed present in course material, and the four cases marked as
parallel-class enrichment are confirmed absent from it — the labelling
was already correct.

One real gap: s.60 (giving notice — a notice is delivered when it reaches
the addressee or their address) appears in presentation 1, the review
slides and the Kozli deck, but was nowhere in the booklet, even though the
booklet leans on the dispatch/delivery distinction it underpins. Added to
the quick page, the statute table and the legislation appendix, in
index.html and in the docx builder.

Print output diffed against the previous PDF: 16 new tokens, all from the
s.60 text; nothing lost.

Co-Authored-By: Claude Opus 5 <noreply@anthropic.com>
</commit_message>
<xml_diff>
--- a/booklet.docx
+++ b/booklet.docx
@@ -5526,6 +5526,104 @@
           </w:p>
         </w:tc>
       </w:tr>
+      <w:tr>
+        <w:tc>
+          <w:tcPr>
+            <w:tcW w:type="dxa" w:w="902"/>
+            <w:shd w:fill="F2F6FC" w:val="clear"/>
+            <w:tcMar>
+              <w:top w:type="dxa" w:w="50"/>
+              <w:left w:type="dxa" w:w="100"/>
+              <w:bottom w:type="dxa" w:w="50"/>
+              <w:right w:type="dxa" w:w="100"/>
+            </w:tcMar>
+          </w:tcPr>
+          <w:p>
+            <w:pPr>
+              <w:bidi/>
+              <w:spacing w:after="0" w:before="0" w:line="276"/>
+            </w:pPr>
+            <w:r>
+              <w:rPr>
+                <w:rFonts w:ascii="Arial" w:cs="Arial" w:eastAsia="Arial" w:hAnsi="Arial"/>
+                <w:b w:val="false"/>
+                <w:bCs w:val="false"/>
+                <w:i w:val="false"/>
+                <w:iCs w:val="false"/>
+                <w:color w:val="222222"/>
+                <w:sz w:val="20"/>
+                <w:szCs w:val="20"/>
+                <w:rtl/>
+              </w:rPr>
+              <w:t xml:space="preserve">60</w:t>
+            </w:r>
+          </w:p>
+        </w:tc>
+        <w:tc>
+          <w:tcPr>
+            <w:tcW w:type="dxa" w:w="5592"/>
+            <w:shd w:fill="F2F6FC" w:val="clear"/>
+            <w:tcMar>
+              <w:top w:type="dxa" w:w="50"/>
+              <w:left w:type="dxa" w:w="100"/>
+              <w:bottom w:type="dxa" w:w="50"/>
+              <w:right w:type="dxa" w:w="100"/>
+            </w:tcMar>
+          </w:tcPr>
+          <w:p>
+            <w:pPr>
+              <w:bidi/>
+              <w:spacing w:after="0" w:before="0" w:line="276"/>
+            </w:pPr>
+            <w:r>
+              <w:rPr>
+                <w:rFonts w:ascii="Arial" w:cs="Arial" w:eastAsia="Arial" w:hAnsi="Arial"/>
+                <w:b w:val="false"/>
+                <w:bCs w:val="false"/>
+                <w:i w:val="false"/>
+                <w:iCs w:val="false"/>
+                <w:color w:val="222222"/>
+                <w:sz w:val="20"/>
+                <w:szCs w:val="20"/>
+                <w:rtl/>
+              </w:rPr>
+              <w:t xml:space="preserve">מתן הודעה: הודעה לפי החוק תינתן בדרך שקבעו הצדדים, ובאין קביעה — בדרך המקובלת בנסיבות. הודעה נמסרת בהגעתה לנמען או למענו.</w:t>
+            </w:r>
+          </w:p>
+        </w:tc>
+        <w:tc>
+          <w:tcPr>
+            <w:tcW w:type="dxa" w:w="2526"/>
+            <w:shd w:fill="F2F6FC" w:val="clear"/>
+            <w:tcMar>
+              <w:top w:type="dxa" w:w="50"/>
+              <w:left w:type="dxa" w:w="100"/>
+              <w:bottom w:type="dxa" w:w="50"/>
+              <w:right w:type="dxa" w:w="100"/>
+            </w:tcMar>
+          </w:tcPr>
+          <w:p>
+            <w:pPr>
+              <w:bidi/>
+              <w:spacing w:after="0" w:before="0" w:line="276"/>
+            </w:pPr>
+            <w:r>
+              <w:rPr>
+                <w:rFonts w:ascii="Arial" w:cs="Arial" w:eastAsia="Arial" w:hAnsi="Arial"/>
+                <w:b w:val="false"/>
+                <w:bCs w:val="false"/>
+                <w:i w:val="false"/>
+                <w:iCs w:val="false"/>
+                <w:color w:val="222222"/>
+                <w:sz w:val="20"/>
+                <w:szCs w:val="20"/>
+                <w:rtl/>
+              </w:rPr>
+              <w:t xml:space="preserve">הגעת הודעה</w:t>
+            </w:r>
+          </w:p>
+        </w:tc>
+      </w:tr>
     </w:tbl>
     <w:p>
       <w:pPr>
@@ -8464,7 +8562,7 @@
           <w:szCs w:val="22"/>
           <w:rtl/>
         </w:rPr>
-        <w:t xml:space="preserve">"מתן הודעת קיבול" = רגע אמירת/משלוח ה"כן"; "מסירת הודעת קיבול" = הגעתו למציע; "מסירת הצעה" = הגעתה לניצע/למענו. היגד שמערבב בין הרגעים — לא נכון.</w:t>
+        <w:t xml:space="preserve">"מתן הודעת קיבול" = רגע אמירת/משלוח ה"כן"; "מסירת הודעת קיבול" = הגעתו למציע; "מסירת הצעה" = הגעתה לניצע/למענו. ההגעה לנמען או למענו נבחנת לפי ס׳ 60. היגד שמערבב בין הרגעים — לא נכון.</w:t>
       </w:r>
     </w:p>
     <w:p>
@@ -14795,6 +14893,69 @@
           <w:rtl/>
         </w:rPr>
         <w:t xml:space="preserve">בפסיקה: פיצויי הסתמכות (שליליים); בחריג — פיצויי קיום (קל בניין).</w:t>
+      </w:r>
+    </w:p>
+    <w:p>
+      <w:pPr>
+        <w:keepNext/>
+        <w:bidi/>
+        <w:spacing w:after="20" w:before="0" w:line="276"/>
+      </w:pPr>
+      <w:r>
+        <w:rPr>
+          <w:rFonts w:ascii="Arial" w:cs="Arial" w:eastAsia="Arial" w:hAnsi="Arial"/>
+          <w:b/>
+          <w:bCs/>
+          <w:i w:val="false"/>
+          <w:iCs w:val="false"/>
+          <w:color w:val="2E5395"/>
+          <w:sz w:val="23"/>
+          <w:szCs w:val="23"/>
+          <w:rtl/>
+        </w:rPr>
+        <w:t xml:space="preserve">ס׳ 60 — מתן הודעה [תמצית]</w:t>
+      </w:r>
+    </w:p>
+    <w:p>
+      <w:pPr>
+        <w:shd w:fill="F2F2F2" w:val="clear"/>
+        <w:bidi/>
+        <w:spacing w:after="120" w:before="0" w:line="276"/>
+        <w:ind w:left="200" w:right="200"/>
+      </w:pPr>
+      <w:r>
+        <w:rPr>
+          <w:rFonts w:ascii="Arial" w:cs="Arial" w:eastAsia="Arial" w:hAnsi="Arial"/>
+          <w:b w:val="false"/>
+          <w:bCs w:val="false"/>
+          <w:i/>
+          <w:iCs/>
+          <w:color w:val="333333"/>
+          <w:sz w:val="22"/>
+          <w:szCs w:val="22"/>
+          <w:rtl/>
+        </w:rPr>
+        <w:t xml:space="preserve">הודעה שיש לתיתה לפי חוק זה תינתן בדרך שקבעו הצדדים, ובאין קביעה — בדרך המקובלת בנסיבות העניין.</w:t>
+      </w:r>
+    </w:p>
+    <w:p>
+      <w:pPr>
+        <w:bidi/>
+        <w:spacing w:after="120" w:before="0" w:line="276"/>
+      </w:pPr>
+      <w:r>
+        <w:rPr>
+          <w:rFonts w:ascii="Arial" w:cs="Arial" w:eastAsia="Arial" w:hAnsi="Arial"/>
+          <w:b w:val="false"/>
+          <w:bCs w:val="false"/>
+          <w:i w:val="false"/>
+          <w:iCs w:val="false"/>
+          <w:color w:val="666666"/>
+          <w:sz w:val="20"/>
+          <w:szCs w:val="20"/>
+          <w:rtl/>
+        </w:rPr>
+        <w:t xml:space="preserve">הודעה נמסרת בהגעתה לנמען או למענו — הבסיס להבחנה בין מתן (יציאת ההודעה) למסירה (הגעתה), שמכריעה בס׳ 10.</w:t>
       </w:r>
     </w:p>
     <w:p>

</xml_diff>

<commit_message>
Edition 4: s.15 (misrepresentation) is in scope — taught on 25.8
The user confirmed a lesson took place on 25.8 and that s.15 was taught in
it. That was the one fact the slides could not settle, and no recording
exists for that date.

- scope line, hero facts, statute table, summary box and legislation
  appendix no longer mark s.15 as "maybe on 1.9"
- the detailed s.15 breakdown moves out of the "not yet taught" appendix
  into the body, so the printed booklet no longer signals it as skippable;
  the appendix now covers s.16-18 only
- practice statements 27-28 (s.15) count as in-scope: the writing lab
  classifies them as core, so quiz mode draws them, and its toggle now
  offers the appendix statements instead
- edition banner bumped to 4

Co-Authored-By: Claude Opus 5 <noreply@anthropic.com>
</commit_message>
<xml_diff>
--- a/booklet.docx
+++ b/booklet.docx
@@ -79,7 +79,7 @@
           <w:szCs w:val="22"/>
           <w:rtl/>
         </w:rPr>
-        <w:t xml:space="preserve">מהדורה 3 — מעודכנת לתנאי הבוחן: ללא מחשבים (25.8)</w:t>
+        <w:t xml:space="preserve">מהדורה 4 — ללא מחשבים · ס׳ 15 נלמד ב-25.8 ונכלל בהיקף (28.8)</w:t>
       </w:r>
     </w:p>
     <w:p>
@@ -238,21 +238,21 @@
           <w:szCs w:val="22"/>
           <w:rtl/>
         </w:rPr>
-        <w:t xml:space="preserve">היקף (נכון ל־25.8, לפי מצב הלימוד בכיתה): </w:t>
-      </w:r>
-      <w:r>
-        <w:rPr>
-          <w:rFonts w:ascii="Arial" w:cs="Arial" w:eastAsia="Arial" w:hAnsi="Arial"/>
-          <w:b w:val="false"/>
-          <w:bCs w:val="false"/>
-          <w:i w:val="false"/>
-          <w:iCs w:val="false"/>
-          <w:color w:val="222222"/>
-          <w:sz w:val="22"/>
-          <w:szCs w:val="22"/>
-          <w:rtl/>
-        </w:rPr>
-        <w:t xml:space="preserve">מצגת מבוא + מצגת 1 במלואה (ס׳ 1–12, השלמת פרטים, זיכרון דברים, תום לב, פ"ד קוזלי) + מצגת 2 עד ס׳ 14(ב), וכן ס׳ 19, 20, 21 (ביטול חלקי, דרך הביטול והשבה).</w:t>
+        <w:t xml:space="preserve">היקף (נכון ל־28.8, לפי מצב הלימוד בכיתה): </w:t>
+      </w:r>
+      <w:r>
+        <w:rPr>
+          <w:rFonts w:ascii="Arial" w:cs="Arial" w:eastAsia="Arial" w:hAnsi="Arial"/>
+          <w:b w:val="false"/>
+          <w:bCs w:val="false"/>
+          <w:i w:val="false"/>
+          <w:iCs w:val="false"/>
+          <w:color w:val="222222"/>
+          <w:sz w:val="22"/>
+          <w:szCs w:val="22"/>
+          <w:rtl/>
+        </w:rPr>
+        <w:t xml:space="preserve">מצגת מבוא + מצגת 1 במלואה (ס׳ 1–12, השלמת פרטים, זיכרון דברים, תום לב, פ"ד קוזלי) + מצגת 2 עד ס׳ 15, וכן ס׳ 19, 20, 21 (ביטול חלקי, דרך הביטול והשבה).</w:t>
       </w:r>
     </w:p>
     <w:p>
@@ -291,7 +291,7 @@
           <w:szCs w:val="22"/>
           <w:rtl/>
         </w:rPr>
-        <w:t xml:space="preserve">ייתכן שיילמד בשיעור שלפני הבוחן (1.9) — נכלל בגוף החוברת עם סימון. ס׳ 16–18 (טעות סופר, כפייה, עושק) טרם נלמדו — הועברו לנספח בסוף.</w:t>
+        <w:t xml:space="preserve">נלמד בשיעור 25.8 — בהיקף המלא, בגוף החוברת. ס׳ 16–18 (טעות סופר, כפייה, עושק) טרם נלמדו — הועברו לנספח בסוף.</w:t>
       </w:r>
     </w:p>
     <w:p>
@@ -567,7 +567,7 @@
           <w:szCs w:val="22"/>
           <w:rtl/>
         </w:rPr>
-        <w:t xml:space="preserve">נספח — חומר שטרם נלמד (הטעיה בהרחבה, טעות סופר, כפייה, עושק)</w:t>
+        <w:t xml:space="preserve">נספח — חומר שטרם נלמד (טעות סופר, כפייה, עושק)</w:t>
       </w:r>
     </w:p>
     <w:p>
@@ -4525,7 +4525,7 @@
                 <w:szCs w:val="20"/>
                 <w:rtl/>
               </w:rPr>
-              <w:t xml:space="preserve">הטעיה — מצג שווא/אי-גילוי שחובה לגלות (לפי דין, נוהג או נסיבות), ע"י הצד השני או מטעמו; קשר סיבתי כפול — ביטול עצמי. [צפוי להילמד ב-1.9]</w:t>
+              <w:t xml:space="preserve">הטעיה — מצג שווא/אי-גילוי שחובה לגלות (לפי דין, נוהג או נסיבות), ע"י הצד השני או מטעמו; קשר סיבתי כפול — ביטול עצמי.</w:t>
             </w:r>
           </w:p>
         </w:tc>
@@ -10977,7 +10977,7 @@
           <w:szCs w:val="22"/>
           <w:rtl/>
         </w:rPr>
-        <w:t xml:space="preserve">הטעיה (ס׳ 15) — צפוי להילמד ב-1.9: </w:t>
+        <w:t xml:space="preserve">הטעיה (ס׳ 15) — נלמד ב-25.8: </w:t>
       </w:r>
       <w:r>
         <w:rPr>
@@ -15233,7 +15233,7 @@
           <w:szCs w:val="23"/>
           <w:rtl/>
         </w:rPr>
-        <w:t xml:space="preserve">ס' 15 — הטעיה [צפוי להילמד ב-1.9]</w:t>
+        <w:t xml:space="preserve">ס׳ 15 — הטעיה</w:t>
       </w:r>
     </w:p>
     <w:p>
@@ -15925,7 +15925,7 @@
           <w:szCs w:val="32"/>
           <w:rtl/>
         </w:rPr>
-        <w:t xml:space="preserve">נספח — חומר שטרם נלמד (נכון ל-25.8)</w:t>
+        <w:t xml:space="preserve">נספח — חומר שטרם נלמד: ס׳ 16–18 (נכון ל-28.8)</w:t>
       </w:r>
     </w:p>
     <w:p>
@@ -15945,7 +15945,7 @@
           <w:szCs w:val="22"/>
           <w:rtl/>
         </w:rPr>
-        <w:t xml:space="preserve">הסעיפים הבאים מופיעים בהמשך מצגת 2 וטרם נלמדו בכיתה. אם המרצה תספיק אותם לפני 8.9 — זה מוכן; אחרת, כנראה לא ייכללו בבוחן.</w:t>
+        <w:t xml:space="preserve">טעות סופר, כפייה ועושק — מופיעים בהמשך מצגת 2 וטרם נלמדו. אם המרצה תספיק אותם ב-1.9 — זה מוכן; אחרת לא ייכללו. ס׳ 15 נלמד ב-25.8 והועבר לגוף החוברת.</w:t>
       </w:r>
     </w:p>
     <w:p>

</xml_diff>

<commit_message>
Add s. 24 to the printed statute pages, and settle the kit's counts
A final pre-print check against the official list found that s. 24
(freedom of content) had no verbatim text anywhere the student can
take to the exam: not in the kit, not in the booklet's appendix, and
not in the lecturer's legislation file, which also lacks ss. 26, 30
and s. 5 of the Gift Law. The kit and the appendix now carry s. 24,
and the kit's checklist says which sections the legislation file is
missing and where to find them.

In the kit, ss. 27-29 and s. 60 are now dimmed and marked as outside
the list, with s. 60(b) added since it is the delivery rule the
in-scope sections lean on. The distinctions table had grown to ten
rows under a heading that still said nine; the index had 73 entries
under a heading that said 71, with one entry out of alphabetical
order. All three are corrected, and the site's description of the kit
matches.

Co-Authored-By: Claude Fable 5.1 <noreply@anthropic.com>
</commit_message>
<xml_diff>
--- a/booklet.docx
+++ b/booklet.docx
@@ -12777,6 +12777,24 @@
       </w:pPr>
       <w:r>
         <w:t>"חוזה יכול שייעשה בעל פה, בכתב או בצורה אחרת, זולת אם היתה צורה מסויימת תנאי לתקפו על פי חוק או הסכם בין הצדדים."</w:t>
+      </w:r>
+    </w:p>
+    <w:p>
+      <w:pPr>
+        <w:bidi/>
+        <w:jc w:val="right"/>
+      </w:pPr>
+      <w:r>
+        <w:t>ס' 24 — תוכן החוזה</w:t>
+      </w:r>
+    </w:p>
+    <w:p>
+      <w:pPr>
+        <w:bidi/>
+        <w:jc w:val="right"/>
+      </w:pPr>
+      <w:r>
+        <w:t>"תוכנו של חוזה יכול שיהיה ככל אשר הסכימו הצדדים."</w:t>
       </w:r>
     </w:p>
     <w:p>

</xml_diff>